<commit_message>
doc(中期&论文): Refactor abstracts and improve clarity in the dissertation
</commit_message>
<xml_diff>
--- a/毕业设计/中期/华羽霄_中期报告表.docx
+++ b/毕业设计/中期/华羽霄_中期报告表.docx
@@ -4,7 +4,7 @@
   <w:body>
     <w:p>
       <w:pPr>
-        <w:spacing w:before="960"/>
+        <w:spacing w:beforeLines="400" w:before="960"/>
         <w:ind w:firstLineChars="0" w:firstLine="0"/>
         <w:jc w:val="center"/>
         <w:rPr>
@@ -93,9 +93,8 @@
     </w:p>
     <w:p>
       <w:pPr>
-        <w:spacing w:before="240" w:after="2160"/>
+        <w:spacing w:beforeLines="100" w:before="240" w:afterLines="900" w:after="2160"/>
         <w:ind w:firstLineChars="0" w:firstLine="0"/>
-        <w:jc w:val="center"/>
         <w:rPr>
           <w:rFonts w:eastAsia="黑体"/>
           <w:spacing w:val="50"/>
@@ -106,7 +105,9 @@
       <w:r>
         <w:rPr>
           <w:rFonts w:eastAsia="黑体"/>
+          <w:spacing w:val="50"/>
           <w:sz w:val="46"/>
+          <w:szCs w:val="46"/>
         </w:rPr>
         <w:t>学术学位研究生学位论文中期考评表</w:t>
       </w:r>
@@ -116,7 +117,7 @@
         <w:tabs>
           <w:tab w:val="left" w:pos="1276"/>
         </w:tabs>
-        <w:spacing w:after="360" w:line="240" w:lineRule="auto"/>
+        <w:spacing w:afterLines="150" w:after="360" w:line="240" w:lineRule="auto"/>
         <w:ind w:firstLineChars="0" w:firstLine="0"/>
         <w:jc w:val="left"/>
         <w:rPr>
@@ -144,33 +145,45 @@
           <w:rFonts w:eastAsia="黑体"/>
           <w:sz w:val="30"/>
         </w:rPr>
-        <w:t xml:space="preserve"> □</w:t>
+        <w:t xml:space="preserve"> </w:t>
       </w:r>
       <w:r>
         <w:rPr>
           <w:rFonts w:eastAsia="黑体"/>
           <w:sz w:val="30"/>
-        </w:rPr>
-        <w:t>博士</w:t>
+          <w:szCs w:val="30"/>
+        </w:rPr>
+        <w:t>□</w:t>
       </w:r>
       <w:r>
         <w:rPr>
           <w:rFonts w:eastAsia="黑体"/>
           <w:sz w:val="30"/>
-        </w:rPr>
-        <w:t xml:space="preserve">        </w:t>
-      </w:r>
-      <w:r>
-        <w:rPr>
-          <w:rFonts w:ascii="Segoe UI Symbol" w:eastAsia="黑体" w:hAnsi="Segoe UI Symbol" w:cs="Segoe UI Symbol"/>
-          <w:sz w:val="30"/>
-        </w:rPr>
-        <w:t>☑</w:t>
+          <w:szCs w:val="30"/>
+        </w:rPr>
+        <w:t>博士</w:t>
       </w:r>
       <w:r>
         <w:rPr>
           <w:rFonts w:eastAsia="黑体"/>
           <w:sz w:val="30"/>
+          <w:szCs w:val="30"/>
+        </w:rPr>
+        <w:t xml:space="preserve">        </w:t>
+      </w:r>
+      <w:r>
+        <w:rPr>
+          <w:rFonts w:eastAsia="黑体"/>
+          <w:sz w:val="30"/>
+          <w:szCs w:val="30"/>
+        </w:rPr>
+        <w:sym w:font="Wingdings 2" w:char="F052"/>
+      </w:r>
+      <w:r>
+        <w:rPr>
+          <w:rFonts w:eastAsia="黑体"/>
+          <w:sz w:val="30"/>
+          <w:szCs w:val="30"/>
         </w:rPr>
         <w:t>硕士</w:t>
       </w:r>
@@ -180,7 +193,7 @@
         <w:tabs>
           <w:tab w:val="left" w:pos="1276"/>
         </w:tabs>
-        <w:spacing w:after="360" w:line="240" w:lineRule="auto"/>
+        <w:spacing w:afterLines="150" w:after="360" w:line="240" w:lineRule="auto"/>
         <w:ind w:firstLineChars="0" w:firstLine="0"/>
         <w:jc w:val="left"/>
         <w:rPr>
@@ -198,28 +211,51 @@
       <w:r>
         <w:rPr>
           <w:rFonts w:eastAsia="黑体"/>
+          <w:spacing w:val="97"/>
+          <w:kern w:val="0"/>
           <w:sz w:val="30"/>
-        </w:rPr>
-        <w:t>学科专业：</w:t>
+          <w:fitText w:val="1800" w:id="-361964540"/>
+        </w:rPr>
+        <w:t>学科专</w:t>
+      </w:r>
+      <w:r>
+        <w:rPr>
+          <w:rFonts w:eastAsia="黑体"/>
+          <w:spacing w:val="7"/>
+          <w:kern w:val="0"/>
+          <w:sz w:val="30"/>
+          <w:fitText w:val="1800" w:id="-361964540"/>
+        </w:rPr>
+        <w:t>业</w:t>
       </w:r>
       <w:r>
         <w:rPr>
           <w:rFonts w:eastAsia="黑体"/>
           <w:sz w:val="30"/>
         </w:rPr>
-        <w:t xml:space="preserve">      </w:t>
+        <w:t>：</w:t>
       </w:r>
       <w:r>
         <w:rPr>
           <w:rFonts w:eastAsia="黑体"/>
           <w:sz w:val="30"/>
-        </w:rPr>
-        <w:t>控制科学与工程</w:t>
+          <w:u w:val="single"/>
+        </w:rPr>
+        <w:t xml:space="preserve">      </w:t>
       </w:r>
       <w:r>
         <w:rPr>
           <w:rFonts w:eastAsia="黑体"/>
           <w:sz w:val="30"/>
+          <w:u w:val="single"/>
+        </w:rPr>
+        <w:t>控制科学与工程</w:t>
+      </w:r>
+      <w:r>
+        <w:rPr>
+          <w:rFonts w:eastAsia="黑体"/>
+          <w:sz w:val="30"/>
+          <w:u w:val="single"/>
         </w:rPr>
         <w:t xml:space="preserve">       </w:t>
       </w:r>
@@ -229,7 +265,7 @@
         <w:tabs>
           <w:tab w:val="left" w:pos="1276"/>
         </w:tabs>
-        <w:spacing w:after="360" w:line="240" w:lineRule="auto"/>
+        <w:spacing w:afterLines="150" w:after="360" w:line="240" w:lineRule="auto"/>
         <w:ind w:firstLineChars="0" w:firstLine="0"/>
         <w:jc w:val="left"/>
         <w:rPr>
@@ -270,6 +306,7 @@
         <w:rPr>
           <w:rFonts w:eastAsia="黑体"/>
           <w:sz w:val="30"/>
+          <w:u w:val="single"/>
         </w:rPr>
         <w:t xml:space="preserve">      </w:t>
       </w:r>
@@ -277,6 +314,7 @@
         <w:rPr>
           <w:rFonts w:eastAsia="黑体"/>
           <w:sz w:val="30"/>
+          <w:u w:val="single"/>
         </w:rPr>
         <w:t>自动化工程学院</w:t>
       </w:r>
@@ -284,6 +322,7 @@
         <w:rPr>
           <w:rFonts w:eastAsia="黑体"/>
           <w:sz w:val="30"/>
+          <w:u w:val="single"/>
         </w:rPr>
         <w:t xml:space="preserve">       </w:t>
       </w:r>
@@ -293,7 +332,7 @@
         <w:tabs>
           <w:tab w:val="left" w:pos="1276"/>
         </w:tabs>
-        <w:spacing w:after="360" w:line="240" w:lineRule="auto"/>
+        <w:spacing w:afterLines="150" w:after="360" w:line="240" w:lineRule="auto"/>
         <w:ind w:firstLineChars="0" w:firstLine="0"/>
         <w:jc w:val="left"/>
         <w:rPr>
@@ -333,8 +372,49 @@
         <w:rPr>
           <w:rFonts w:eastAsia="黑体"/>
           <w:sz w:val="30"/>
-        </w:rPr>
-        <w:t xml:space="preserve">       202421060724        </w:t>
+          <w:u w:val="single"/>
+        </w:rPr>
+        <w:t xml:space="preserve">       202</w:t>
+      </w:r>
+      <w:r>
+        <w:rPr>
+          <w:rFonts w:eastAsia="黑体" w:hint="eastAsia"/>
+          <w:sz w:val="30"/>
+          <w:u w:val="single"/>
+        </w:rPr>
+        <w:t>4</w:t>
+      </w:r>
+      <w:r>
+        <w:rPr>
+          <w:rFonts w:eastAsia="黑体"/>
+          <w:sz w:val="30"/>
+          <w:u w:val="single"/>
+        </w:rPr>
+        <w:t>210607</w:t>
+      </w:r>
+      <w:r>
+        <w:rPr>
+          <w:rFonts w:eastAsia="黑体"/>
+          <w:sz w:val="30"/>
+          <w:u w:val="single"/>
+        </w:rPr>
+        <w:t>2</w:t>
+      </w:r>
+      <w:r>
+        <w:rPr>
+          <w:rFonts w:eastAsia="黑体" w:hint="eastAsia"/>
+          <w:sz w:val="30"/>
+          <w:u w:val="single"/>
+        </w:rPr>
+        <w:t>4</w:t>
+      </w:r>
+      <w:r>
+        <w:rPr>
+          <w:rFonts w:eastAsia="黑体"/>
+          <w:sz w:val="30"/>
+          <w:u w:val="single"/>
+        </w:rPr>
+        <w:t xml:space="preserve">        </w:t>
       </w:r>
     </w:p>
     <w:p>
@@ -342,7 +422,7 @@
         <w:tabs>
           <w:tab w:val="left" w:pos="1276"/>
         </w:tabs>
-        <w:spacing w:after="360" w:line="240" w:lineRule="auto"/>
+        <w:spacing w:afterLines="150" w:after="360" w:line="240" w:lineRule="auto"/>
         <w:ind w:firstLineChars="0" w:firstLine="0"/>
         <w:jc w:val="left"/>
         <w:rPr>
@@ -382,20 +462,23 @@
         <w:rPr>
           <w:rFonts w:eastAsia="黑体"/>
           <w:sz w:val="30"/>
+          <w:u w:val="single"/>
         </w:rPr>
         <w:t xml:space="preserve">           </w:t>
+      </w:r>
+      <w:r>
+        <w:rPr>
+          <w:rFonts w:eastAsia="黑体" w:hint="eastAsia"/>
+          <w:sz w:val="30"/>
+          <w:u w:val="single"/>
+        </w:rPr>
+        <w:t>华羽霄</w:t>
       </w:r>
       <w:r>
         <w:rPr>
           <w:rFonts w:eastAsia="黑体"/>
           <w:sz w:val="30"/>
-        </w:rPr>
-        <w:t>华羽霄</w:t>
-      </w:r>
-      <w:r>
-        <w:rPr>
-          <w:rFonts w:eastAsia="黑体"/>
-          <w:sz w:val="30"/>
+          <w:u w:val="single"/>
         </w:rPr>
         <w:t xml:space="preserve">          </w:t>
       </w:r>
@@ -405,7 +488,7 @@
         <w:tabs>
           <w:tab w:val="left" w:pos="1276"/>
         </w:tabs>
-        <w:spacing w:before="120" w:after="360" w:line="240" w:lineRule="auto"/>
+        <w:spacing w:before="120" w:afterLines="150" w:after="360" w:line="240" w:lineRule="auto"/>
         <w:ind w:firstLineChars="0" w:firstLine="0"/>
         <w:jc w:val="left"/>
         <w:rPr>
@@ -414,8 +497,6 @@
           <w:u w:val="single"/>
         </w:rPr>
       </w:pPr>
-      <w:bookmarkStart w:id="0" w:name="OLE_LINK11"/>
-      <w:bookmarkStart w:id="1" w:name="OLE_LINK10"/>
       <w:r>
         <w:rPr>
           <w:rFonts w:eastAsia="黑体"/>
@@ -426,33 +507,87 @@
       <w:r>
         <w:rPr>
           <w:rFonts w:eastAsia="黑体"/>
+          <w:spacing w:val="97"/>
+          <w:kern w:val="0"/>
           <w:sz w:val="30"/>
-        </w:rPr>
-        <w:t>论文题目：</w:t>
+          <w:fitText w:val="1800" w:id="-361964539"/>
+        </w:rPr>
+        <w:t>论文题</w:t>
+      </w:r>
+      <w:r>
+        <w:rPr>
+          <w:rFonts w:eastAsia="黑体"/>
+          <w:spacing w:val="7"/>
+          <w:kern w:val="0"/>
+          <w:sz w:val="30"/>
+          <w:fitText w:val="1800" w:id="-361964539"/>
+        </w:rPr>
+        <w:t>目</w:t>
       </w:r>
       <w:r>
         <w:rPr>
           <w:rFonts w:eastAsia="黑体"/>
           <w:sz w:val="30"/>
         </w:rPr>
-        <w:t xml:space="preserve">  </w:t>
+        <w:t>：</w:t>
       </w:r>
       <w:r>
         <w:rPr>
           <w:rFonts w:eastAsia="黑体"/>
           <w:sz w:val="30"/>
-        </w:rPr>
-        <w:t>基于多模态逐级物理约束的</w:t>
-      </w:r>
-      <w:bookmarkEnd w:id="0"/>
-      <w:bookmarkEnd w:id="1"/>
+          <w:u w:val="single"/>
+        </w:rPr>
+        <w:t xml:space="preserve"> </w:t>
+      </w:r>
+      <w:bookmarkStart w:id="0" w:name="OLE_LINK10"/>
+      <w:bookmarkStart w:id="1" w:name="OLE_LINK11"/>
+      <w:r>
+        <w:rPr>
+          <w:rFonts w:eastAsia="黑体" w:hint="eastAsia"/>
+          <w:sz w:val="30"/>
+          <w:u w:val="single"/>
+        </w:rPr>
+        <w:t>基于</w:t>
+      </w:r>
+      <w:r>
+        <w:rPr>
+          <w:rFonts w:eastAsia="黑体" w:hint="eastAsia"/>
+          <w:sz w:val="30"/>
+          <w:u w:val="single"/>
+        </w:rPr>
+        <w:t>多模态物理逐级</w:t>
+      </w:r>
+      <w:r>
+        <w:rPr>
+          <w:rFonts w:eastAsia="黑体" w:hint="eastAsia"/>
+          <w:sz w:val="30"/>
+          <w:u w:val="single"/>
+        </w:rPr>
+        <w:t>的</w:t>
+      </w:r>
+      <w:r>
+        <w:rPr>
+          <w:rFonts w:eastAsia="黑体" w:hint="eastAsia"/>
+          <w:sz w:val="30"/>
+          <w:u w:val="single"/>
+        </w:rPr>
+        <w:t>无人机</w:t>
+      </w:r>
+      <w:r>
+        <w:rPr>
+          <w:rFonts w:eastAsia="黑体"/>
+          <w:sz w:val="30"/>
+          <w:u w:val="single"/>
+        </w:rPr>
+        <w:t xml:space="preserve"> </w:t>
+      </w:r>
     </w:p>
     <w:p>
       <w:pPr>
         <w:tabs>
           <w:tab w:val="left" w:pos="1276"/>
         </w:tabs>
-        <w:spacing w:after="360" w:line="240" w:lineRule="auto"/>
+        <w:spacing w:afterLines="150" w:after="360" w:line="240" w:lineRule="auto"/>
         <w:ind w:firstLineChars="0" w:firstLine="0"/>
         <w:jc w:val="left"/>
         <w:rPr>
@@ -466,21 +601,65 @@
           <w:sz w:val="30"/>
         </w:rPr>
         <w:tab/>
-        <w:t xml:space="preserve">                   </w:t>
+        <w:t xml:space="preserve">              </w:t>
       </w:r>
       <w:r>
         <w:rPr>
           <w:rFonts w:eastAsia="黑体"/>
           <w:sz w:val="30"/>
-        </w:rPr>
-        <w:t>无人机自主电磁超声探测技术研究</w:t>
+          <w:u w:val="single"/>
+        </w:rPr>
+        <w:t xml:space="preserve"> </w:t>
+      </w:r>
+      <w:bookmarkEnd w:id="0"/>
+      <w:bookmarkEnd w:id="1"/>
+      <w:r>
+        <w:rPr>
+          <w:rFonts w:eastAsia="黑体" w:hint="eastAsia"/>
+          <w:sz w:val="30"/>
+          <w:u w:val="single"/>
+        </w:rPr>
+        <w:t xml:space="preserve"> </w:t>
+      </w:r>
+      <w:r>
+        <w:rPr>
+          <w:rFonts w:eastAsia="黑体" w:hint="eastAsia"/>
+          <w:sz w:val="30"/>
+          <w:u w:val="single"/>
+        </w:rPr>
+        <w:t>自主电磁超声</w:t>
+      </w:r>
+      <w:r>
+        <w:rPr>
+          <w:rFonts w:eastAsia="黑体" w:hint="eastAsia"/>
+          <w:sz w:val="30"/>
+          <w:u w:val="single"/>
+        </w:rPr>
+        <w:t>探测技术</w:t>
+      </w:r>
+      <w:r>
+        <w:rPr>
+          <w:rFonts w:eastAsia="黑体" w:hint="eastAsia"/>
+          <w:sz w:val="30"/>
+          <w:u w:val="single"/>
+        </w:rPr>
+        <w:t>研究</w:t>
+      </w:r>
+      <w:r>
+        <w:rPr>
+          <w:rFonts w:eastAsia="黑体" w:hint="eastAsia"/>
+          <w:sz w:val="30"/>
+          <w:u w:val="single"/>
+        </w:rPr>
+        <w:t xml:space="preserve"> </w:t>
       </w:r>
       <w:r>
         <w:rPr>
           <w:rFonts w:eastAsia="黑体"/>
           <w:sz w:val="30"/>
-        </w:rPr>
-        <w:t xml:space="preserve">    </w:t>
+          <w:u w:val="single"/>
+        </w:rPr>
+        <w:t xml:space="preserve"> </w:t>
       </w:r>
     </w:p>
     <w:p>
@@ -488,7 +667,7 @@
         <w:tabs>
           <w:tab w:val="left" w:pos="1276"/>
         </w:tabs>
-        <w:spacing w:after="360" w:line="240" w:lineRule="auto"/>
+        <w:spacing w:afterLines="150" w:after="360" w:line="240" w:lineRule="auto"/>
         <w:ind w:firstLineChars="0" w:firstLine="0"/>
         <w:jc w:val="left"/>
         <w:rPr>
@@ -507,42 +686,67 @@
       <w:r>
         <w:rPr>
           <w:rFonts w:eastAsia="黑体"/>
+          <w:spacing w:val="97"/>
+          <w:kern w:val="0"/>
           <w:sz w:val="30"/>
-        </w:rPr>
-        <w:t>指导教师：</w:t>
+          <w:fitText w:val="1800" w:id="-361964538"/>
+        </w:rPr>
+        <w:t>指导教</w:t>
+      </w:r>
+      <w:r>
+        <w:rPr>
+          <w:rFonts w:eastAsia="黑体"/>
+          <w:spacing w:val="7"/>
+          <w:kern w:val="0"/>
+          <w:sz w:val="30"/>
+          <w:fitText w:val="1800" w:id="-361964538"/>
+        </w:rPr>
+        <w:t>师</w:t>
       </w:r>
       <w:r>
         <w:rPr>
           <w:rFonts w:eastAsia="黑体"/>
           <w:sz w:val="30"/>
         </w:rPr>
-        <w:t xml:space="preserve">        </w:t>
+        <w:t>：</w:t>
       </w:r>
       <w:r>
         <w:rPr>
           <w:rFonts w:eastAsia="黑体"/>
           <w:sz w:val="30"/>
-        </w:rPr>
-        <w:t>高斌</w:t>
+          <w:u w:val="single"/>
+        </w:rPr>
+        <w:t xml:space="preserve">        </w:t>
       </w:r>
       <w:r>
         <w:rPr>
           <w:rFonts w:eastAsia="黑体"/>
           <w:sz w:val="30"/>
-        </w:rPr>
-        <w:t xml:space="preserve">  </w:t>
+          <w:u w:val="single"/>
+        </w:rPr>
+        <w:t>高斌</w:t>
       </w:r>
       <w:r>
         <w:rPr>
           <w:rFonts w:eastAsia="黑体"/>
           <w:sz w:val="30"/>
-        </w:rPr>
-        <w:t>教授</w:t>
+          <w:u w:val="single"/>
+        </w:rPr>
+        <w:t xml:space="preserve">  </w:t>
       </w:r>
       <w:r>
         <w:rPr>
           <w:rFonts w:eastAsia="黑体"/>
           <w:sz w:val="30"/>
+          <w:u w:val="single"/>
+        </w:rPr>
+        <w:t>教授</w:t>
+      </w:r>
+      <w:r>
+        <w:rPr>
+          <w:rFonts w:eastAsia="黑体"/>
+          <w:sz w:val="30"/>
+          <w:u w:val="single"/>
         </w:rPr>
         <w:t xml:space="preserve">         </w:t>
       </w:r>
@@ -552,7 +756,7 @@
         <w:tabs>
           <w:tab w:val="left" w:pos="1276"/>
         </w:tabs>
-        <w:spacing w:after="360" w:line="240" w:lineRule="auto"/>
+        <w:spacing w:afterLines="150" w:after="360" w:line="240" w:lineRule="auto"/>
         <w:ind w:firstLineChars="0" w:firstLine="0"/>
         <w:jc w:val="left"/>
         <w:rPr>
@@ -571,44 +775,99 @@
       <w:r>
         <w:rPr>
           <w:rFonts w:eastAsia="黑体"/>
+          <w:spacing w:val="97"/>
+          <w:kern w:val="0"/>
           <w:sz w:val="30"/>
-        </w:rPr>
-        <w:t>填表日期：</w:t>
+          <w:fitText w:val="1800" w:id="-361964537"/>
+        </w:rPr>
+        <w:t>填表日</w:t>
+      </w:r>
+      <w:r>
+        <w:rPr>
+          <w:rFonts w:eastAsia="黑体"/>
+          <w:spacing w:val="7"/>
+          <w:kern w:val="0"/>
+          <w:sz w:val="30"/>
+          <w:fitText w:val="1800" w:id="-361964537"/>
+        </w:rPr>
+        <w:t>期</w:t>
       </w:r>
       <w:r>
         <w:rPr>
           <w:rFonts w:eastAsia="黑体"/>
           <w:sz w:val="30"/>
         </w:rPr>
-        <w:t xml:space="preserve">  2026  </w:t>
+        <w:t>：</w:t>
       </w:r>
       <w:r>
         <w:rPr>
           <w:rFonts w:eastAsia="黑体"/>
           <w:sz w:val="30"/>
-        </w:rPr>
-        <w:t>年</w:t>
+          <w:u w:val="single"/>
+        </w:rPr>
+        <w:t xml:space="preserve">  202</w:t>
+      </w:r>
+      <w:r>
+        <w:rPr>
+          <w:rFonts w:eastAsia="黑体" w:hint="eastAsia"/>
+          <w:sz w:val="30"/>
+          <w:u w:val="single"/>
+        </w:rPr>
+        <w:t>6</w:t>
       </w:r>
       <w:r>
         <w:rPr>
           <w:rFonts w:eastAsia="黑体"/>
           <w:sz w:val="30"/>
-        </w:rPr>
-        <w:t xml:space="preserve">   5  </w:t>
+          <w:u w:val="single"/>
+        </w:rPr>
+        <w:t xml:space="preserve">  </w:t>
       </w:r>
       <w:r>
         <w:rPr>
           <w:rFonts w:eastAsia="黑体"/>
           <w:sz w:val="30"/>
         </w:rPr>
-        <w:t>月</w:t>
+        <w:t>年</w:t>
       </w:r>
       <w:r>
         <w:rPr>
           <w:rFonts w:eastAsia="黑体"/>
           <w:sz w:val="30"/>
-        </w:rPr>
-        <w:t xml:space="preserve">   27   </w:t>
+          <w:u w:val="single"/>
+        </w:rPr>
+        <w:t xml:space="preserve">  10  </w:t>
+      </w:r>
+      <w:r>
+        <w:rPr>
+          <w:rFonts w:eastAsia="黑体"/>
+          <w:sz w:val="30"/>
+        </w:rPr>
+        <w:t>月</w:t>
+      </w:r>
+      <w:r>
+        <w:rPr>
+          <w:rFonts w:eastAsia="黑体"/>
+          <w:sz w:val="30"/>
+          <w:u w:val="single"/>
+        </w:rPr>
+        <w:t xml:space="preserve">   </w:t>
+      </w:r>
+      <w:r>
+        <w:rPr>
+          <w:rFonts w:eastAsia="黑体" w:hint="eastAsia"/>
+          <w:sz w:val="30"/>
+          <w:u w:val="single"/>
+        </w:rPr>
+        <w:t>13</w:t>
+      </w:r>
+      <w:r>
+        <w:rPr>
+          <w:rFonts w:eastAsia="黑体"/>
+          <w:sz w:val="30"/>
+          <w:u w:val="single"/>
+        </w:rPr>
+        <w:t xml:space="preserve">   </w:t>
       </w:r>
       <w:r>
         <w:rPr>
@@ -623,7 +882,7 @@
         <w:tabs>
           <w:tab w:val="left" w:pos="1276"/>
         </w:tabs>
-        <w:spacing w:after="360" w:line="240" w:lineRule="auto"/>
+        <w:spacing w:afterLines="150" w:after="360" w:line="240" w:lineRule="auto"/>
         <w:ind w:firstLineChars="0" w:firstLine="0"/>
         <w:jc w:val="left"/>
         <w:rPr>
@@ -637,13 +896,31 @@
         <w:tabs>
           <w:tab w:val="left" w:pos="1276"/>
         </w:tabs>
-        <w:spacing w:line="240" w:lineRule="auto"/>
+        <w:spacing w:afterLines="150" w:after="360" w:line="240" w:lineRule="auto"/>
         <w:ind w:firstLineChars="1200" w:firstLine="3840"/>
         <w:jc w:val="left"/>
         <w:rPr>
           <w:rFonts w:eastAsia="黑体"/>
           <w:sz w:val="30"/>
           <w:u w:val="single"/>
+        </w:rPr>
+      </w:pPr>
+      <w:r>
+        <w:rPr>
+          <w:rFonts w:eastAsia="楷体"/>
+          <w:sz w:val="32"/>
+        </w:rPr>
+        <w:t>电子科技大学研究生院</w:t>
+      </w:r>
+    </w:p>
+    <w:p>
+      <w:pPr>
+        <w:spacing w:beforeLines="700" w:before="1680"/>
+        <w:ind w:firstLine="640"/>
+        <w:jc w:val="left"/>
+        <w:rPr>
+          <w:rFonts w:eastAsia="楷体"/>
+          <w:sz w:val="32"/>
         </w:rPr>
         <w:sectPr>
           <w:headerReference w:type="even" r:id="rId8"/>
@@ -652,29 +929,16 @@
           <w:footerReference w:type="default" r:id="rId11"/>
           <w:headerReference w:type="first" r:id="rId12"/>
           <w:footerReference w:type="first" r:id="rId13"/>
-          <w:pgSz w:w="11906" w:h="16838"/>
+          <w:pgSz w:w="11906" w:h="16838" w:code="9"/>
           <w:pgMar w:top="1418" w:right="1191" w:bottom="1418" w:left="1474" w:header="851" w:footer="992" w:gutter="0"/>
-          <w:cols w:space="720"/>
-          <w:formProt w:val="0"/>
+          <w:cols w:space="425"/>
           <w:docGrid w:linePitch="312"/>
         </w:sectPr>
       </w:pPr>
-      <w:r>
-        <w:rPr>
-          <w:rFonts w:eastAsia="楷体"/>
-          <w:sz w:val="32"/>
-        </w:rPr>
-        <w:t>电子科技大学研究生院</w:t>
-      </w:r>
     </w:p>
     <w:p>
       <w:pPr>
-        <w:numPr>
-          <w:ilvl w:val="0"/>
-          <w:numId w:val="1"/>
-        </w:numPr>
-        <w:ind w:left="0" w:firstLineChars="0" w:firstLine="0"/>
-        <w:jc w:val="center"/>
+        <w:ind w:firstLineChars="0" w:firstLine="0"/>
         <w:rPr>
           <w:rFonts w:eastAsia="黑体"/>
           <w:bCs/>
@@ -944,7 +1208,16 @@
               <w:jc w:val="left"/>
             </w:pPr>
             <w:r>
-              <w:t>本课题面向无人机无损检测中探头接触状态难以精确判定的核心问题，构建融合电磁超声回波、位姿误差及</w:t>
+              <w:t>本课题面向无人机无损检测中探头接触状态难以精确判定的核心问题，构建融合</w:t>
+            </w:r>
+            <w:r>
+              <w:rPr>
+                <w:rFonts w:hint="eastAsia"/>
+              </w:rPr>
+              <w:t xml:space="preserve"> EMAT </w:t>
+            </w:r>
+            <w:r>
+              <w:t>回波、位姿误差及</w:t>
             </w:r>
             <w:r>
               <w:t>RGBD</w:t>
@@ -4597,6 +4870,10 @@
               <w:spacing w:before="60" w:after="60" w:line="300" w:lineRule="auto"/>
               <w:ind w:firstLine="420"/>
               <w:jc w:val="center"/>
+              <w:rPr>
+                <w:rFonts w:eastAsiaTheme="minorEastAsia"/>
+                <w:i/>
+              </w:rPr>
             </w:pPr>
             <m:oMathPara>
               <m:oMath>
@@ -4604,8 +4881,424 @@
                   <w:rPr>
                     <w:rFonts w:ascii="Cambria Math" w:eastAsia="Times New Roman" w:hAnsi="Cambria Math"/>
                   </w:rPr>
-                  <m:t>\mathbf{g}_t=\operatorname{softmax}\left(\mathbf{W}_g\left[\mathbf{z}^{u}_t;\mathbf{z}^{p}_t;\mathbf{z}^{v}_t\right]+\mathbf{b}_g\right)</m:t>
+                  <m:t>\mathbf</m:t>
                 </m:r>
+                <m:sSub>
+                  <m:sSubPr>
+                    <m:ctrlPr>
+                      <w:rPr>
+                        <w:rFonts w:ascii="Cambria Math" w:eastAsia="Times New Roman" w:hAnsi="Cambria Math"/>
+                        <w:i/>
+                      </w:rPr>
+                    </m:ctrlPr>
+                  </m:sSubPr>
+                  <m:e>
+                    <m:d>
+                      <m:dPr>
+                        <m:begChr m:val="{"/>
+                        <m:endChr m:val="}"/>
+                        <m:ctrlPr>
+                          <w:rPr>
+                            <w:rFonts w:ascii="Cambria Math" w:eastAsia="Times New Roman" w:hAnsi="Cambria Math"/>
+                            <w:i/>
+                          </w:rPr>
+                        </m:ctrlPr>
+                      </m:dPr>
+                      <m:e>
+                        <m:r>
+                          <w:rPr>
+                            <w:rFonts w:ascii="Cambria Math" w:eastAsia="Times New Roman" w:hAnsi="Cambria Math"/>
+                          </w:rPr>
+                          <m:t>g</m:t>
+                        </m:r>
+                      </m:e>
+                    </m:d>
+                  </m:e>
+                  <m:sub>
+                    <m:r>
+                      <w:rPr>
+                        <w:rFonts w:ascii="Cambria Math" w:eastAsia="Times New Roman" w:hAnsi="Cambria Math"/>
+                      </w:rPr>
+                      <m:t>t</m:t>
+                    </m:r>
+                  </m:sub>
+                </m:sSub>
+                <m:r>
+                  <w:rPr>
+                    <w:rFonts w:ascii="Cambria Math" w:eastAsia="Times New Roman" w:hAnsi="Cambria Math"/>
+                  </w:rPr>
+                  <m:t>=\operatorname</m:t>
+                </m:r>
+                <m:d>
+                  <m:dPr>
+                    <m:begChr m:val="{"/>
+                    <m:endChr m:val="}"/>
+                    <m:ctrlPr>
+                      <w:rPr>
+                        <w:rFonts w:ascii="Cambria Math" w:eastAsia="Times New Roman" w:hAnsi="Cambria Math"/>
+                        <w:i/>
+                      </w:rPr>
+                    </m:ctrlPr>
+                  </m:dPr>
+                  <m:e>
+                    <m:r>
+                      <w:rPr>
+                        <w:rFonts w:ascii="Cambria Math" w:eastAsia="Times New Roman" w:hAnsi="Cambria Math"/>
+                      </w:rPr>
+                      <m:t>softmax</m:t>
+                    </m:r>
+                  </m:e>
+                </m:d>
+                <m:d>
+                  <m:dPr>
+                    <m:begChr m:val=""/>
+                    <m:ctrlPr>
+                      <w:rPr>
+                        <w:rFonts w:ascii="Cambria Math" w:eastAsia="Times New Roman" w:hAnsi="Cambria Math"/>
+                        <w:i/>
+                      </w:rPr>
+                    </m:ctrlPr>
+                  </m:dPr>
+                  <m:e>
+                    <m:d>
+                      <m:dPr>
+                        <m:endChr m:val=""/>
+                        <m:ctrlPr>
+                          <w:rPr>
+                            <w:rFonts w:ascii="Cambria Math" w:eastAsia="Times New Roman" w:hAnsi="Cambria Math"/>
+                            <w:i/>
+                          </w:rPr>
+                        </m:ctrlPr>
+                      </m:dPr>
+                      <m:e>
+                        <m:r>
+                          <w:rPr>
+                            <w:rFonts w:ascii="Cambria Math" w:eastAsia="Times New Roman" w:hAnsi="Cambria Math"/>
+                          </w:rPr>
+                          <m:t>\mathbf</m:t>
+                        </m:r>
+                        <m:sSub>
+                          <m:sSubPr>
+                            <m:ctrlPr>
+                              <w:rPr>
+                                <w:rFonts w:ascii="Cambria Math" w:eastAsia="Times New Roman" w:hAnsi="Cambria Math"/>
+                                <w:i/>
+                              </w:rPr>
+                            </m:ctrlPr>
+                          </m:sSubPr>
+                          <m:e>
+                            <m:d>
+                              <m:dPr>
+                                <m:begChr m:val="{"/>
+                                <m:endChr m:val="}"/>
+                                <m:ctrlPr>
+                                  <w:rPr>
+                                    <w:rFonts w:ascii="Cambria Math" w:eastAsia="Times New Roman" w:hAnsi="Cambria Math"/>
+                                    <w:i/>
+                                  </w:rPr>
+                                </m:ctrlPr>
+                              </m:dPr>
+                              <m:e>
+                                <m:r>
+                                  <w:rPr>
+                                    <w:rFonts w:ascii="Cambria Math" w:eastAsia="Times New Roman" w:hAnsi="Cambria Math"/>
+                                  </w:rPr>
+                                  <m:t>W</m:t>
+                                </m:r>
+                              </m:e>
+                            </m:d>
+                          </m:e>
+                          <m:sub>
+                            <m:r>
+                              <w:rPr>
+                                <w:rFonts w:ascii="Cambria Math" w:eastAsia="Times New Roman" w:hAnsi="Cambria Math"/>
+                              </w:rPr>
+                              <m:t>g</m:t>
+                            </m:r>
+                            <m:d>
+                              <m:dPr>
+                                <m:begChr m:val=""/>
+                                <m:endChr m:val="]"/>
+                                <m:ctrlPr>
+                                  <w:rPr>
+                                    <w:rFonts w:ascii="Cambria Math" w:eastAsia="Times New Roman" w:hAnsi="Cambria Math"/>
+                                    <w:i/>
+                                  </w:rPr>
+                                </m:ctrlPr>
+                              </m:dPr>
+                              <m:e>
+                                <m:d>
+                                  <m:dPr>
+                                    <m:begChr m:val="["/>
+                                    <m:endChr m:val=""/>
+                                    <m:ctrlPr>
+                                      <w:rPr>
+                                        <w:rFonts w:ascii="Cambria Math" w:eastAsia="Times New Roman" w:hAnsi="Cambria Math"/>
+                                        <w:i/>
+                                      </w:rPr>
+                                    </m:ctrlPr>
+                                  </m:dPr>
+                                  <m:e>
+                                    <m:r>
+                                      <w:rPr>
+                                        <w:rFonts w:ascii="Cambria Math" w:eastAsia="Times New Roman" w:hAnsi="Cambria Math"/>
+                                      </w:rPr>
+                                      <m:t>\mathbf</m:t>
+                                    </m:r>
+                                    <m:sSubSup>
+                                      <m:sSubSupPr>
+                                        <m:ctrlPr>
+                                          <w:rPr>
+                                            <w:rFonts w:ascii="Cambria Math" w:eastAsia="Times New Roman" w:hAnsi="Cambria Math"/>
+                                            <w:i/>
+                                          </w:rPr>
+                                        </m:ctrlPr>
+                                      </m:sSubSupPr>
+                                      <m:e>
+                                        <m:d>
+                                          <m:dPr>
+                                            <m:begChr m:val="{"/>
+                                            <m:endChr m:val="}"/>
+                                            <m:ctrlPr>
+                                              <w:rPr>
+                                                <w:rFonts w:ascii="Cambria Math" w:eastAsia="Times New Roman" w:hAnsi="Cambria Math"/>
+                                                <w:i/>
+                                              </w:rPr>
+                                            </m:ctrlPr>
+                                          </m:dPr>
+                                          <m:e>
+                                            <m:r>
+                                              <w:rPr>
+                                                <w:rFonts w:ascii="Cambria Math" w:eastAsia="Times New Roman" w:hAnsi="Cambria Math"/>
+                                              </w:rPr>
+                                              <m:t>z</m:t>
+                                            </m:r>
+                                          </m:e>
+                                        </m:d>
+                                      </m:e>
+                                      <m:sub>
+                                        <m:r>
+                                          <w:rPr>
+                                            <w:rFonts w:ascii="Cambria Math" w:eastAsia="Times New Roman" w:hAnsi="Cambria Math"/>
+                                          </w:rPr>
+                                          <m:t>t</m:t>
+                                        </m:r>
+                                      </m:sub>
+                                      <m:sup>
+                                        <m:d>
+                                          <m:dPr>
+                                            <m:begChr m:val="{"/>
+                                            <m:endChr m:val="}"/>
+                                            <m:ctrlPr>
+                                              <w:rPr>
+                                                <w:rFonts w:ascii="Cambria Math" w:eastAsia="Times New Roman" w:hAnsi="Cambria Math"/>
+                                                <w:i/>
+                                              </w:rPr>
+                                            </m:ctrlPr>
+                                          </m:dPr>
+                                          <m:e>
+                                            <m:r>
+                                              <w:rPr>
+                                                <w:rFonts w:ascii="Cambria Math" w:eastAsia="Times New Roman" w:hAnsi="Cambria Math"/>
+                                              </w:rPr>
+                                              <m:t>u</m:t>
+                                            </m:r>
+                                          </m:e>
+                                        </m:d>
+                                      </m:sup>
+                                    </m:sSubSup>
+                                    <m:r>
+                                      <w:rPr>
+                                        <w:rFonts w:ascii="Cambria Math" w:eastAsia="Times New Roman" w:hAnsi="Cambria Math"/>
+                                      </w:rPr>
+                                      <m:t>;\mathbf</m:t>
+                                    </m:r>
+                                    <m:sSubSup>
+                                      <m:sSubSupPr>
+                                        <m:ctrlPr>
+                                          <w:rPr>
+                                            <w:rFonts w:ascii="Cambria Math" w:eastAsia="Times New Roman" w:hAnsi="Cambria Math"/>
+                                            <w:i/>
+                                          </w:rPr>
+                                        </m:ctrlPr>
+                                      </m:sSubSupPr>
+                                      <m:e>
+                                        <m:d>
+                                          <m:dPr>
+                                            <m:begChr m:val="{"/>
+                                            <m:endChr m:val="}"/>
+                                            <m:ctrlPr>
+                                              <w:rPr>
+                                                <w:rFonts w:ascii="Cambria Math" w:eastAsia="Times New Roman" w:hAnsi="Cambria Math"/>
+                                                <w:i/>
+                                              </w:rPr>
+                                            </m:ctrlPr>
+                                          </m:dPr>
+                                          <m:e>
+                                            <m:r>
+                                              <w:rPr>
+                                                <w:rFonts w:ascii="Cambria Math" w:eastAsia="Times New Roman" w:hAnsi="Cambria Math"/>
+                                              </w:rPr>
+                                              <m:t>z</m:t>
+                                            </m:r>
+                                          </m:e>
+                                        </m:d>
+                                      </m:e>
+                                      <m:sub>
+                                        <m:r>
+                                          <w:rPr>
+                                            <w:rFonts w:ascii="Cambria Math" w:eastAsia="Times New Roman" w:hAnsi="Cambria Math"/>
+                                          </w:rPr>
+                                          <m:t>t</m:t>
+                                        </m:r>
+                                      </m:sub>
+                                      <m:sup>
+                                        <m:d>
+                                          <m:dPr>
+                                            <m:begChr m:val="{"/>
+                                            <m:endChr m:val="}"/>
+                                            <m:ctrlPr>
+                                              <w:rPr>
+                                                <w:rFonts w:ascii="Cambria Math" w:eastAsia="Times New Roman" w:hAnsi="Cambria Math"/>
+                                                <w:i/>
+                                              </w:rPr>
+                                            </m:ctrlPr>
+                                          </m:dPr>
+                                          <m:e>
+                                            <m:r>
+                                              <w:rPr>
+                                                <w:rFonts w:ascii="Cambria Math" w:eastAsia="Times New Roman" w:hAnsi="Cambria Math"/>
+                                              </w:rPr>
+                                              <m:t>p</m:t>
+                                            </m:r>
+                                          </m:e>
+                                        </m:d>
+                                      </m:sup>
+                                    </m:sSubSup>
+                                    <m:r>
+                                      <w:rPr>
+                                        <w:rFonts w:ascii="Cambria Math" w:eastAsia="Times New Roman" w:hAnsi="Cambria Math"/>
+                                      </w:rPr>
+                                      <m:t>;\mathbf</m:t>
+                                    </m:r>
+                                    <m:sSubSup>
+                                      <m:sSubSupPr>
+                                        <m:ctrlPr>
+                                          <w:rPr>
+                                            <w:rFonts w:ascii="Cambria Math" w:eastAsia="Times New Roman" w:hAnsi="Cambria Math"/>
+                                            <w:i/>
+                                          </w:rPr>
+                                        </m:ctrlPr>
+                                      </m:sSubSupPr>
+                                      <m:e>
+                                        <m:d>
+                                          <m:dPr>
+                                            <m:begChr m:val="{"/>
+                                            <m:endChr m:val="}"/>
+                                            <m:ctrlPr>
+                                              <w:rPr>
+                                                <w:rFonts w:ascii="Cambria Math" w:eastAsia="Times New Roman" w:hAnsi="Cambria Math"/>
+                                                <w:i/>
+                                              </w:rPr>
+                                            </m:ctrlPr>
+                                          </m:dPr>
+                                          <m:e>
+                                            <m:r>
+                                              <w:rPr>
+                                                <w:rFonts w:ascii="Cambria Math" w:eastAsia="Times New Roman" w:hAnsi="Cambria Math"/>
+                                              </w:rPr>
+                                              <m:t>z</m:t>
+                                            </m:r>
+                                          </m:e>
+                                        </m:d>
+                                      </m:e>
+                                      <m:sub>
+                                        <m:r>
+                                          <w:rPr>
+                                            <w:rFonts w:ascii="Cambria Math" w:eastAsia="Times New Roman" w:hAnsi="Cambria Math"/>
+                                          </w:rPr>
+                                          <m:t>t</m:t>
+                                        </m:r>
+                                      </m:sub>
+                                      <m:sup>
+                                        <m:d>
+                                          <m:dPr>
+                                            <m:begChr m:val="{"/>
+                                            <m:endChr m:val="}"/>
+                                            <m:ctrlPr>
+                                              <w:rPr>
+                                                <w:rFonts w:ascii="Cambria Math" w:eastAsia="Times New Roman" w:hAnsi="Cambria Math"/>
+                                                <w:i/>
+                                              </w:rPr>
+                                            </m:ctrlPr>
+                                          </m:dPr>
+                                          <m:e>
+                                            <m:r>
+                                              <w:rPr>
+                                                <w:rFonts w:ascii="Cambria Math" w:eastAsia="Times New Roman" w:hAnsi="Cambria Math"/>
+                                              </w:rPr>
+                                              <m:t>v</m:t>
+                                            </m:r>
+                                          </m:e>
+                                        </m:d>
+                                      </m:sup>
+                                    </m:sSubSup>
+                                  </m:e>
+                                </m:d>
+                              </m:e>
+                            </m:d>
+                          </m:sub>
+                        </m:sSub>
+                        <m:r>
+                          <w:rPr>
+                            <w:rFonts w:ascii="Cambria Math" w:eastAsia="Times New Roman" w:hAnsi="Cambria Math"/>
+                          </w:rPr>
+                          <m:t>+\mathbf</m:t>
+                        </m:r>
+                        <m:sSub>
+                          <m:sSubPr>
+                            <m:ctrlPr>
+                              <w:rPr>
+                                <w:rFonts w:ascii="Cambria Math" w:eastAsia="Times New Roman" w:hAnsi="Cambria Math"/>
+                                <w:i/>
+                              </w:rPr>
+                            </m:ctrlPr>
+                          </m:sSubPr>
+                          <m:e>
+                            <m:d>
+                              <m:dPr>
+                                <m:begChr m:val="{"/>
+                                <m:endChr m:val="}"/>
+                                <m:ctrlPr>
+                                  <w:rPr>
+                                    <w:rFonts w:ascii="Cambria Math" w:eastAsia="Times New Roman" w:hAnsi="Cambria Math"/>
+                                    <w:i/>
+                                  </w:rPr>
+                                </m:ctrlPr>
+                              </m:dPr>
+                              <m:e>
+                                <m:r>
+                                  <w:rPr>
+                                    <w:rFonts w:ascii="Cambria Math" w:eastAsia="Times New Roman" w:hAnsi="Cambria Math"/>
+                                  </w:rPr>
+                                  <m:t>b</m:t>
+                                </m:r>
+                              </m:e>
+                            </m:d>
+                          </m:e>
+                          <m:sub>
+                            <m:r>
+                              <w:rPr>
+                                <w:rFonts w:ascii="Cambria Math" w:eastAsia="Times New Roman" w:hAnsi="Cambria Math"/>
+                              </w:rPr>
+                              <m:t>g</m:t>
+                            </m:r>
+                          </m:sub>
+                        </m:sSub>
+                      </m:e>
+                    </m:d>
+                  </m:e>
+                </m:d>
               </m:oMath>
             </m:oMathPara>
           </w:p>
@@ -5027,11 +5720,8 @@
               <w:jc w:val="left"/>
             </w:pPr>
             <w:r>
-              <w:t>理论框架还必须回答数据如何支撑模型。无人机接触检测并不存在天然完美标签：视觉上看似接近的时刻，超声回波可能仍未进入有效耦合区；回波突然增强的时刻，也可能来自电磁噪声或姿态冲</w:t>
-            </w:r>
-            <w:r>
               <w:lastRenderedPageBreak/>
-              <w:t>击。因此，本研究计划采用弱标签与人工复核结合的方式构建训练集。初始标签由状态机事件、位姿误差阈值和回波稳定度共同生成，再通过局部窗口复核修正临界片段，使模型学习到连续过程而非孤立帧。</w:t>
+              <w:t>理论框架还必须回答数据如何支撑模型。无人机接触检测并不存在天然完美标签：视觉上看似接近的时刻，超声回波可能仍未进入有效耦合区；回波突然增强的时刻，也可能来自电磁噪声或姿态冲击。因此，本研究计划采用弱标签与人工复核结合的方式构建训练集。初始标签由状态机事件、位姿误差阈值和回波稳定度共同生成，再通过局部窗口复核修正临界片段，使模型学习到连续过程而非孤立帧。</w:t>
             </w:r>
           </w:p>
           <w:p>
@@ -5934,17 +6624,14 @@
               <w:jc w:val="left"/>
             </w:pPr>
             <w:r>
+              <w:lastRenderedPageBreak/>
               <w:t>下一阶段将基于已采集数据完成特征标注、模型训练与消融实验，重点验证物理约束注意力相对于单模态阈值、普通</w:t>
             </w:r>
             <w:r>
               <w:t>Transformer</w:t>
             </w:r>
             <w:r>
-              <w:t>和简单特征拼接方法的提升幅度。预期评价指标包括接触判别准确</w:t>
-            </w:r>
-            <w:r>
-              <w:lastRenderedPageBreak/>
-              <w:t>率、临界状态误报率、接触概率时序平滑度以及无人机闭环扫查稳定性，从而为论文后续章节提供可量化的实验依据。</w:t>
+              <w:t>和简单特征拼接方法的提升幅度。预期评价指标包括接触判别准确率、临界状态误报率、接触概率时序平滑度以及无人机闭环扫查稳定性，从而为论文后续章节提供可量化的实验依据。</w:t>
             </w:r>
           </w:p>
           <w:p>
@@ -5959,7 +6646,7 @@
                 <w:b/>
                 <w:sz w:val="22"/>
               </w:rPr>
-              <w:t>3</w:t>
+              <w:t>5</w:t>
             </w:r>
             <w:r>
               <w:rPr>
@@ -5967,7 +6654,15 @@
                 <w:b/>
                 <w:sz w:val="22"/>
               </w:rPr>
-              <w:t>、已完成的主要工作</w:t>
+              <w:t>、</w:t>
+            </w:r>
+            <w:r>
+              <w:rPr>
+                <w:rFonts w:eastAsia="黑体" w:hint="eastAsia"/>
+                <w:b/>
+                <w:sz w:val="22"/>
+              </w:rPr>
+              <w:t>实验结果</w:t>
             </w:r>
           </w:p>
           <w:p>
@@ -5976,26 +6671,47 @@
               <w:ind w:firstLine="422"/>
               <w:jc w:val="left"/>
             </w:pPr>
+            <w:r>
+              <w:rPr>
+                <w:rFonts w:eastAsia="黑体" w:hint="eastAsia"/>
+                <w:b/>
+              </w:rPr>
+              <w:t>5</w:t>
+            </w:r>
             <w:r>
               <w:rPr>
                 <w:rFonts w:eastAsia="黑体"/>
                 <w:b/>
               </w:rPr>
-              <w:t xml:space="preserve">2.1 </w:t>
+              <w:t>.</w:t>
+            </w:r>
+            <w:r>
+              <w:rPr>
+                <w:rFonts w:eastAsia="黑体" w:hint="eastAsia"/>
+                <w:b/>
+              </w:rPr>
+              <w:t>1</w:t>
             </w:r>
             <w:r>
               <w:rPr>
                 <w:rFonts w:eastAsia="黑体"/>
                 <w:b/>
               </w:rPr>
-              <w:t>文献调研与理论框架（</w:t>
+              <w:t xml:space="preserve"> </w:t>
             </w:r>
             <w:r>
               <w:rPr>
                 <w:rFonts w:eastAsia="黑体"/>
                 <w:b/>
               </w:rPr>
-              <w:t>2025.07—2025.10</w:t>
+              <w:t>无人机实验平台搭建与集成（</w:t>
+            </w:r>
+            <w:r>
+              <w:rPr>
+                <w:rFonts w:eastAsia="黑体"/>
+                <w:b/>
+              </w:rPr>
+              <w:t>2025.11—2026.01</w:t>
             </w:r>
             <w:r>
               <w:rPr>
@@ -6012,79 +6728,61 @@
               <w:jc w:val="left"/>
             </w:pPr>
             <w:r>
-              <w:t>系统梳理了三个方向的国内外研究现状：无人机接触式无损检测、电磁超声换能器原理与测厚技术、物理约束神经网络与</w:t>
-            </w:r>
-            <w:r>
-              <w:t>Transformer</w:t>
-            </w:r>
-            <w:r>
-              <w:t>架构。共完成</w:t>
-            </w:r>
-            <w:r>
-              <w:t>32</w:t>
-            </w:r>
-            <w:r>
-              <w:t>篇文献的阅读与整理，涵盖无人机</w:t>
-            </w:r>
-            <w:r>
-              <w:t>NDT</w:t>
-            </w:r>
-            <w:r>
-              <w:t>系统设计（</w:t>
-            </w:r>
-            <w:r>
-              <w:t>Watson</w:t>
-            </w:r>
-            <w:r>
-              <w:t>等、</w:t>
-            </w:r>
-            <w:r>
-              <w:t>Marcellini</w:t>
-            </w:r>
-            <w:r>
-              <w:t>等、</w:t>
-            </w:r>
-            <w:r>
-              <w:t>Kocer</w:t>
-            </w:r>
-            <w:r>
-              <w:t>等）、</w:t>
-            </w:r>
-            <w:r>
-              <w:t>EMAT</w:t>
-            </w:r>
-            <w:r>
-              <w:t>测厚方法（</w:t>
-            </w:r>
-            <w:r>
-              <w:t>Chen</w:t>
-            </w:r>
-            <w:r>
-              <w:t>、</w:t>
-            </w:r>
-            <w:r>
-              <w:t>Kubrusly</w:t>
-            </w:r>
-            <w:r>
-              <w:t>、涂君等）、物理信息神经网络（</w:t>
-            </w:r>
-            <w:r>
-              <w:t>RAMP-Net</w:t>
-            </w:r>
-            <w:r>
-              <w:t>、</w:t>
-            </w:r>
-            <w:r>
-              <w:t>PINNsFormer</w:t>
-            </w:r>
-            <w:r>
-              <w:t>、</w:t>
-            </w:r>
-            <w:r>
-              <w:t>MPFusionNet</w:t>
-            </w:r>
-            <w:r>
-              <w:t>）等核心领域。由此明确三大关键技术问题：单模态检测在动态飞行平台上的局限性、纯数据驱动模型缺乏物理约束导致的泛化不足、接触判定结果的时序抖动。</w:t>
+              <w:t>完成无人机系统平台搭建，集成</w:t>
+            </w:r>
+            <w:r>
+              <w:t>Livox MID-360</w:t>
+            </w:r>
+            <w:r>
+              <w:t>激光雷达、</w:t>
+            </w:r>
+            <w:r>
+              <w:t>Intel RealSense D435</w:t>
+            </w:r>
+            <w:r>
+              <w:t>深度相机与</w:t>
+            </w:r>
+            <w:r>
+              <w:t>PX4</w:t>
+            </w:r>
+            <w:r>
+              <w:t>飞控。通过</w:t>
+            </w:r>
+            <w:r>
+              <w:t>MAVROS</w:t>
+            </w:r>
+            <w:r>
+              <w:t>实现飞控与地面计算机通信，利用</w:t>
+            </w:r>
+            <w:r>
+              <w:t>FAST-LIO 2.0</w:t>
+            </w:r>
+            <w:r>
+              <w:t>（</w:t>
+            </w:r>
+            <w:r>
+              <w:t>IEKF + ikd-Tree</w:t>
+            </w:r>
+            <w:r>
+              <w:t>）提供实时</w:t>
+            </w:r>
+            <w:r>
+              <w:t>6-DOF</w:t>
+            </w:r>
+            <w:r>
+              <w:t>位姿估计。开发</w:t>
+            </w:r>
+            <w:r>
+              <w:t>lidar_to_mavros.py</w:t>
+            </w:r>
+            <w:r>
+              <w:t>桥接节点，将里程计数据转换为</w:t>
+            </w:r>
+            <w:r>
+              <w:t>MAVROS</w:t>
+            </w:r>
+            <w:r>
+              <w:t>视觉位姿反馈。系统已实现遥控下的姿态稳定飞行。</w:t>
             </w:r>
           </w:p>
           <w:p>
@@ -6105,21 +6803,21 @@
                 <w:rFonts w:eastAsia="黑体"/>
                 <w:b/>
               </w:rPr>
-              <w:t xml:space="preserve">.2 </w:t>
+              <w:t xml:space="preserve">.3 </w:t>
             </w:r>
             <w:r>
               <w:rPr>
                 <w:rFonts w:eastAsia="黑体"/>
                 <w:b/>
               </w:rPr>
-              <w:t>无人机实验平台搭建与集成（</w:t>
+              <w:t>电磁超声探头硬件开发与调试（</w:t>
             </w:r>
             <w:r>
               <w:rPr>
                 <w:rFonts w:eastAsia="黑体"/>
                 <w:b/>
               </w:rPr>
-              <w:t>2025.11—2026.01</w:t>
+              <w:t>2026.02—2026.04</w:t>
             </w:r>
             <w:r>
               <w:rPr>
@@ -6136,61 +6834,97 @@
               <w:jc w:val="left"/>
             </w:pPr>
             <w:r>
-              <w:t>完成无人机系统平台搭建，集成</w:t>
-            </w:r>
-            <w:r>
-              <w:t>Livox MID-360</w:t>
-            </w:r>
-            <w:r>
-              <w:t>激光雷达、</w:t>
-            </w:r>
-            <w:r>
-              <w:t>Intel RealSense D435</w:t>
-            </w:r>
-            <w:r>
-              <w:t>深度相机与</w:t>
-            </w:r>
-            <w:r>
-              <w:t>PX4</w:t>
-            </w:r>
-            <w:r>
-              <w:t>飞控。通过</w:t>
-            </w:r>
-            <w:r>
-              <w:t>MAVROS</w:t>
-            </w:r>
-            <w:r>
-              <w:t>实现飞控与地面计算机通信，利用</w:t>
-            </w:r>
-            <w:r>
-              <w:t>FAST-LIO 2.0</w:t>
-            </w:r>
-            <w:r>
-              <w:t>（</w:t>
-            </w:r>
-            <w:r>
-              <w:t>IEKF + ikd-Tree</w:t>
-            </w:r>
-            <w:r>
-              <w:t>）提供实时</w:t>
-            </w:r>
-            <w:r>
-              <w:t>6-DOF</w:t>
-            </w:r>
-            <w:r>
-              <w:t>位姿估计。开发</w:t>
-            </w:r>
-            <w:r>
-              <w:t>lidar_to_mavros.py</w:t>
-            </w:r>
-            <w:r>
-              <w:t>桥接节点，将里程计数据转换为</w:t>
-            </w:r>
-            <w:r>
-              <w:t>MAVROS</w:t>
-            </w:r>
-            <w:r>
-              <w:t>视觉位姿反馈。系统已实现遥控下的姿态稳定飞行。</w:t>
+              <w:t>完成</w:t>
+            </w:r>
+            <w:r>
+              <w:t>EMAT</w:t>
+            </w:r>
+            <w:r>
+              <w:t>探头制作与调试。开发</w:t>
+            </w:r>
+            <w:r>
+              <w:t>ROS</w:t>
+            </w:r>
+            <w:r>
+              <w:t>驱动节点，通过</w:t>
+            </w:r>
+            <w:r>
+              <w:t>USB</w:t>
+            </w:r>
+            <w:r>
+              <w:t>直连</w:t>
+            </w:r>
+            <w:r>
+              <w:t>CH346C</w:t>
+            </w:r>
+            <w:r>
+              <w:t>芯片，以二进制协议（</w:t>
+            </w:r>
+            <w:r>
+              <w:t>0xAB</w:t>
+            </w:r>
+            <w:r>
+              <w:t>头，</w:t>
+            </w:r>
+            <w:r>
+              <w:t>CRC-8</w:t>
+            </w:r>
+            <w:r>
+              <w:t>校验）实现通信。支持厚度读取、波形采集（</w:t>
+            </w:r>
+            <w:r>
+              <w:t>4</w:t>
+            </w:r>
+            <w:r>
+              <w:t>块</w:t>
+            </w:r>
+            <w:r>
+              <w:t>×8185</w:t>
+            </w:r>
+            <w:r>
+              <w:t>采样点，</w:t>
+            </w:r>
+            <w:r>
+              <w:t>8-bit ADC</w:t>
+            </w:r>
+            <w:r>
+              <w:t>）、参数配置等命令。波形采集频率约</w:t>
+            </w:r>
+            <w:r>
+              <w:t>40 Hz</w:t>
+            </w:r>
+            <w:r>
+              <w:t>。开发</w:t>
+            </w:r>
+            <w:r>
+              <w:t>Qt5 C++</w:t>
+            </w:r>
+            <w:r>
+              <w:t>可视化工具，采用</w:t>
+            </w:r>
+            <w:r>
+              <w:t>ring buffer + QTimer</w:t>
+            </w:r>
+            <w:r>
+              <w:t>架构（</w:t>
+            </w:r>
+            <w:r>
+              <w:t>25 ms</w:t>
+            </w:r>
+            <w:r>
+              <w:t>刷新），支持</w:t>
+            </w:r>
+            <w:r>
+              <w:t>DC</w:t>
+            </w:r>
+            <w:r>
+              <w:t>去除与</w:t>
+            </w:r>
+            <w:r>
+              <w:t>RMS</w:t>
+            </w:r>
+            <w:r>
+              <w:t>显示。</w:t>
             </w:r>
           </w:p>
           <w:p>
@@ -6211,25 +6945,46 @@
                 <w:rFonts w:eastAsia="黑体"/>
                 <w:b/>
               </w:rPr>
-              <w:t xml:space="preserve">.3 </w:t>
+              <w:t xml:space="preserve">.4 </w:t>
             </w:r>
             <w:r>
               <w:rPr>
                 <w:rFonts w:eastAsia="黑体"/>
                 <w:b/>
               </w:rPr>
-              <w:t>电磁超声探头硬件开发与调试（</w:t>
+              <w:t>多模态数据采集系统构建</w:t>
+            </w:r>
+            <w:r>
+              <w:rPr>
+                <w:rFonts w:eastAsia="黑体" w:hint="eastAsia"/>
+                <w:b/>
+              </w:rPr>
+              <w:t>（</w:t>
+            </w:r>
+            <w:r>
+              <w:rPr>
+                <w:rFonts w:eastAsia="黑体" w:hint="eastAsia"/>
+                <w:b/>
+              </w:rPr>
+              <w:t xml:space="preserve">2026.05 </w:t>
             </w:r>
             <w:r>
               <w:rPr>
                 <w:rFonts w:eastAsia="黑体"/>
                 <w:b/>
               </w:rPr>
-              <w:t>2026.02—2026.04</w:t>
+              <w:t>–</w:t>
             </w:r>
             <w:r>
               <w:rPr>
-                <w:rFonts w:eastAsia="黑体"/>
+                <w:rFonts w:eastAsia="黑体" w:hint="eastAsia"/>
+                <w:b/>
+              </w:rPr>
+              <w:t xml:space="preserve"> 2026.06</w:t>
+            </w:r>
+            <w:r>
+              <w:rPr>
+                <w:rFonts w:eastAsia="黑体" w:hint="eastAsia"/>
                 <w:b/>
               </w:rPr>
               <w:t>）</w:t>
@@ -6242,109 +6997,31 @@
               <w:jc w:val="left"/>
             </w:pPr>
             <w:r>
-              <w:t>完成</w:t>
+              <w:t>开发基于视觉</w:t>
+            </w:r>
+            <w:r>
+              <w:t>ROI</w:t>
+            </w:r>
+            <w:r>
+              <w:t>的自主规划程序：用户在</w:t>
+            </w:r>
+            <w:r>
+              <w:t>RGB</w:t>
+            </w:r>
+            <w:r>
+              <w:t>图像中选取目标区域后，系统完成路径规划与末端精确接近。飞行过程中同步采集位姿、</w:t>
+            </w:r>
+            <w:r>
+              <w:t>RGBD</w:t>
+            </w:r>
+            <w:r>
+              <w:t>视频流与</w:t>
             </w:r>
             <w:r>
               <w:t>EMAT</w:t>
             </w:r>
             <w:r>
-              <w:t>探头制作与调试。开发</w:t>
-            </w:r>
-            <w:r>
-              <w:t>ROS</w:t>
-            </w:r>
-            <w:r>
-              <w:t>驱动节点，通过</w:t>
-            </w:r>
-            <w:r>
-              <w:t>USB</w:t>
-            </w:r>
-            <w:r>
-              <w:t>直连</w:t>
-            </w:r>
-            <w:r>
-              <w:t>CH346C</w:t>
-            </w:r>
-            <w:r>
-              <w:t>芯片，以二进制协议（</w:t>
-            </w:r>
-            <w:r>
-              <w:t>0xAB</w:t>
-            </w:r>
-            <w:r>
-              <w:t>头，</w:t>
-            </w:r>
-            <w:r>
-              <w:t>CRC-8</w:t>
-            </w:r>
-            <w:r>
-              <w:t>校验）实现通信。支持厚度读取、波形采集（</w:t>
-            </w:r>
-            <w:r>
-              <w:t>4</w:t>
-            </w:r>
-            <w:r>
-              <w:t>块</w:t>
-            </w:r>
-            <w:r>
-              <w:t>×8185</w:t>
-            </w:r>
-            <w:r>
-              <w:t>采样点，</w:t>
-            </w:r>
-            <w:r>
-              <w:t>8-bit ADC</w:t>
-            </w:r>
-            <w:r>
-              <w:t>）、参数配置等命令。波形采集频率约</w:t>
-            </w:r>
-            <w:r>
-              <w:t>40 Hz</w:t>
-            </w:r>
-            <w:r>
-              <w:t>。开发</w:t>
-            </w:r>
-            <w:r>
-              <w:t>Qt5 C++</w:t>
-            </w:r>
-            <w:r>
-              <w:t>可视化工具，采用</w:t>
-            </w:r>
-            <w:r>
-              <w:t>ring buffer + QTimer</w:t>
-            </w:r>
-            <w:r>
-              <w:t>架构（</w:t>
-            </w:r>
-            <w:r>
-              <w:t>25 ms</w:t>
-            </w:r>
-            <w:r>
-              <w:t>刷新），支持</w:t>
-            </w:r>
-            <w:r>
-              <w:t>DC</w:t>
-            </w:r>
-            <w:r>
-              <w:t>去除与</w:t>
-            </w:r>
-            <w:r>
-              <w:t>RMS</w:t>
-            </w:r>
-            <w:r>
-              <w:t>显示。通过</w:t>
-            </w:r>
-            <w:r>
-              <w:t>udev</w:t>
-            </w:r>
-            <w:r>
-              <w:t>规则实现免</w:t>
-            </w:r>
-            <w:r>
-              <w:t>sudo</w:t>
-            </w:r>
-            <w:r>
-              <w:t>访问，具备断线自动重连能力。</w:t>
+              <w:t>回波信号，构建结构化多模态数据集，为后续模型训练提供数据支撑。</w:t>
             </w:r>
           </w:p>
           <w:p>
@@ -6365,68 +7042,6 @@
                 <w:rFonts w:eastAsia="黑体"/>
                 <w:b/>
               </w:rPr>
-              <w:t xml:space="preserve">.4 </w:t>
-            </w:r>
-            <w:r>
-              <w:rPr>
-                <w:rFonts w:eastAsia="黑体"/>
-                <w:b/>
-              </w:rPr>
-              <w:t>多模态数据采集系统构建</w:t>
-            </w:r>
-          </w:p>
-          <w:p>
-            <w:pPr>
-              <w:spacing w:line="300" w:lineRule="auto"/>
-              <w:ind w:firstLine="420"/>
-              <w:jc w:val="left"/>
-            </w:pPr>
-            <w:r>
-              <w:t>开发基于视觉</w:t>
-            </w:r>
-            <w:r>
-              <w:t>ROI</w:t>
-            </w:r>
-            <w:r>
-              <w:t>的自主规划程序：用户在</w:t>
-            </w:r>
-            <w:r>
-              <w:t>RGB</w:t>
-            </w:r>
-            <w:r>
-              <w:t>图像中选取目标区域后，系统完成路径规划与末端精确接近。飞行过程中同步采集位姿、</w:t>
-            </w:r>
-            <w:r>
-              <w:t>RGBD</w:t>
-            </w:r>
-            <w:r>
-              <w:t>视频流与</w:t>
-            </w:r>
-            <w:r>
-              <w:t>EMAT</w:t>
-            </w:r>
-            <w:r>
-              <w:t>回波信号，构建结构化多模态数据集，为后续模型训练提供数据支撑。</w:t>
-            </w:r>
-          </w:p>
-          <w:p>
-            <w:pPr>
-              <w:spacing w:before="40" w:after="20" w:line="300" w:lineRule="auto"/>
-              <w:ind w:firstLine="422"/>
-              <w:jc w:val="left"/>
-            </w:pPr>
-            <w:r>
-              <w:rPr>
-                <w:rFonts w:eastAsia="黑体" w:hint="eastAsia"/>
-                <w:b/>
-              </w:rPr>
-              <w:t>3</w:t>
-            </w:r>
-            <w:r>
-              <w:rPr>
-                <w:rFonts w:eastAsia="黑体"/>
-                <w:b/>
-              </w:rPr>
               <w:t xml:space="preserve">.5 </w:t>
             </w:r>
             <w:r>
@@ -6444,19 +7059,7 @@
               <w:jc w:val="left"/>
             </w:pPr>
             <w:r>
-              <w:t>实现无人机完全自动驾驶下的任意曲面稳定接触。采用位置</w:t>
-            </w:r>
-            <w:r>
-              <w:t>-</w:t>
-            </w:r>
-            <w:r>
-              <w:t>速度串级</w:t>
-            </w:r>
-            <w:r>
-              <w:t>PID</w:t>
-            </w:r>
-            <w:r>
-              <w:t>控制，验证了从视觉引导到接触建立再到稳定扫查的完整流程。</w:t>
+              <w:t>实现无人机完全自动驾驶下的任意曲面稳定接触，验证了从视觉引导到接触建立再到稳定扫查的完整流程。</w:t>
             </w:r>
           </w:p>
         </w:tc>
@@ -6517,7 +7120,6 @@
               <w:jc w:val="left"/>
             </w:pPr>
             <w:r>
-              <w:lastRenderedPageBreak/>
               <w:t>按《研究生学位论文撰写格式规范》的格式要求分类填写与学位论文相关的阶段性研究成果</w:t>
             </w:r>
           </w:p>
@@ -6607,6 +7209,12 @@
               <w:t>PX4</w:t>
             </w:r>
             <w:r>
+              <w:rPr>
+                <w:rFonts w:hint="eastAsia"/>
+              </w:rPr>
+              <w:t>-Autopilot</w:t>
+            </w:r>
+            <w:r>
               <w:t>飞控，实现自主飞行与多模态数据同步采集。</w:t>
             </w:r>
           </w:p>
@@ -6650,13 +7258,7 @@
               <w:t>EMAT ROS</w:t>
             </w:r>
             <w:r>
-              <w:t>驱动节点（</w:t>
-            </w:r>
-            <w:r>
-              <w:t>C++17</w:t>
-            </w:r>
-            <w:r>
-              <w:t>），支持二进制协议通信、自动重连与</w:t>
+              <w:t>驱动节点，支持二进制协议通信、自动重连与</w:t>
             </w:r>
             <w:r>
               <w:t>Qt5</w:t>
@@ -6806,6 +7408,7 @@
               <w:jc w:val="left"/>
             </w:pPr>
             <w:r>
+              <w:lastRenderedPageBreak/>
               <w:t>导师对工作进展及研究计划的意见：</w:t>
             </w:r>
           </w:p>
@@ -7350,7 +7953,6 @@
               <w:jc w:val="right"/>
             </w:pPr>
             <w:r>
-              <w:lastRenderedPageBreak/>
               <w:t>负责人签名：</w:t>
             </w:r>
             <w:r>
@@ -7697,6 +8299,7 @@
               </w:rPr>
             </w:pPr>
             <w:r>
+              <w:lastRenderedPageBreak/>
               <w:t>2026.05-2026.11</w:t>
             </w:r>
           </w:p>
@@ -7885,7 +8488,6 @@
     <w:pPr>
       <w:pStyle w:val="a6"/>
       <w:ind w:firstLine="360"/>
-      <w:jc w:val="center"/>
     </w:pPr>
   </w:p>
 </w:ftr>

</xml_diff>

<commit_message>
doc(论文): Modified thesis-uestc.cls to adjust spacing after tabular environment for improved formatting.
</commit_message>
<xml_diff>
--- a/毕业设计/中期/华羽霄_中期报告表.docx
+++ b/毕业设计/中期/华羽霄_中期报告表.docx
@@ -859,7 +859,15 @@
           <w:sz w:val="30"/>
           <w:u w:val="single"/>
         </w:rPr>
-        <w:t>13</w:t>
+        <w:t>2</w:t>
+      </w:r>
+      <w:r>
+        <w:rPr>
+          <w:rFonts w:eastAsia="黑体" w:hint="eastAsia"/>
+          <w:sz w:val="30"/>
+          <w:u w:val="single"/>
+        </w:rPr>
+        <w:t>4</w:t>
       </w:r>
       <w:r>
         <w:rPr>
@@ -4871,8 +4879,7 @@
               <w:ind w:firstLine="420"/>
               <w:jc w:val="center"/>
               <w:rPr>
-                <w:rFonts w:eastAsiaTheme="minorEastAsia"/>
-                <w:i/>
+                <w:rFonts w:hint="eastAsia"/>
               </w:rPr>
             </w:pPr>
             <m:oMathPara>
@@ -6704,21 +6711,144 @@
                 <w:rFonts w:eastAsia="黑体"/>
                 <w:b/>
               </w:rPr>
-              <w:t>无人机实验平台搭建与集成（</w:t>
-            </w:r>
+              <w:t>无人机实验平台搭建与集成</w:t>
+            </w:r>
+          </w:p>
+          <w:p>
+            <w:pPr>
+              <w:spacing w:line="300" w:lineRule="auto"/>
+              <w:ind w:firstLine="420"/>
+              <w:jc w:val="left"/>
+            </w:pPr>
+            <w:r>
+              <w:t>本课题搭建了面向金属结构表面电磁超声无损检测的自适应探测无人机实验平台，实现了飞行控制、多源感知、状态估计与超声信号采集等功能的集成。飞行平台采用</w:t>
+            </w:r>
+            <w:r>
+              <w:t>S2-450</w:t>
+            </w:r>
+            <w:r>
+              <w:t>多旋翼无人机，以</w:t>
+            </w:r>
+            <w:r>
+              <w:t>PX4-Autopilot</w:t>
+            </w:r>
+            <w:r>
+              <w:t>为飞控核心，通过</w:t>
+            </w:r>
+            <w:r>
+              <w:t>MAVROS</w:t>
+            </w:r>
+            <w:r>
+              <w:t>实现局部位置与速度控制，单次续航约</w:t>
+            </w:r>
+            <w:r>
+              <w:t>15 min</w:t>
+            </w:r>
+            <w:r>
+              <w:t>。机载计算平台采用</w:t>
+            </w:r>
+            <w:r>
+              <w:t>NVIDIA Jetson Orin Nano</w:t>
+            </w:r>
+            <w:r>
+              <w:t>，运行</w:t>
+            </w:r>
+            <w:r>
+              <w:t>Ubuntu 20.04</w:t>
+            </w:r>
+            <w:r>
+              <w:t>与</w:t>
+            </w:r>
+            <w:r>
+              <w:t>ROS Noetic</w:t>
+            </w:r>
+            <w:r>
+              <w:t>，负责多模态数据同步采集、接触状态模型在线推理及飞控通信。</w:t>
+            </w:r>
+          </w:p>
+          <w:p>
+            <w:pPr>
+              <w:spacing w:line="300" w:lineRule="auto"/>
+              <w:ind w:firstLineChars="0" w:firstLine="0"/>
+              <w:jc w:val="center"/>
+            </w:pPr>
             <w:r>
               <w:rPr>
-                <w:rFonts w:eastAsia="黑体"/>
-                <w:b/>
+                <w:noProof/>
               </w:rPr>
-              <w:t>2025.11—2026.01</w:t>
-            </w:r>
+              <w:drawing>
+                <wp:inline distT="0" distB="0" distL="0" distR="0" wp14:anchorId="180FECD9" wp14:editId="55110753">
+                  <wp:extent cx="2846705" cy="2131695"/>
+                  <wp:effectExtent l="0" t="0" r="0" b="0"/>
+                  <wp:docPr id="1702754273" name="图片 1"/>
+                  <wp:cNvGraphicFramePr>
+                    <a:graphicFrameLocks xmlns:a="http://schemas.openxmlformats.org/drawingml/2006/main" noChangeAspect="1"/>
+                  </wp:cNvGraphicFramePr>
+                  <a:graphic xmlns:a="http://schemas.openxmlformats.org/drawingml/2006/main">
+                    <a:graphicData uri="http://schemas.openxmlformats.org/drawingml/2006/picture">
+                      <pic:pic xmlns:pic="http://schemas.openxmlformats.org/drawingml/2006/picture">
+                        <pic:nvPicPr>
+                          <pic:cNvPr id="0" name="Picture 1"/>
+                          <pic:cNvPicPr>
+                            <a:picLocks noChangeAspect="1" noChangeArrowheads="1"/>
+                          </pic:cNvPicPr>
+                        </pic:nvPicPr>
+                        <pic:blipFill>
+                          <a:blip r:embed="rId14">
+                            <a:extLst>
+                              <a:ext uri="{28A0092B-C50C-407E-A947-70E740481C1C}">
+                                <a14:useLocalDpi xmlns:a14="http://schemas.microsoft.com/office/drawing/2010/main" val="0"/>
+                              </a:ext>
+                            </a:extLst>
+                          </a:blip>
+                          <a:srcRect/>
+                          <a:stretch>
+                            <a:fillRect/>
+                          </a:stretch>
+                        </pic:blipFill>
+                        <pic:spPr bwMode="auto">
+                          <a:xfrm>
+                            <a:off x="0" y="0"/>
+                            <a:ext cx="2846705" cy="2131695"/>
+                          </a:xfrm>
+                          <a:prstGeom prst="rect">
+                            <a:avLst/>
+                          </a:prstGeom>
+                          <a:noFill/>
+                          <a:ln>
+                            <a:noFill/>
+                          </a:ln>
+                        </pic:spPr>
+                      </pic:pic>
+                    </a:graphicData>
+                  </a:graphic>
+                </wp:inline>
+              </w:drawing>
+            </w:r>
+          </w:p>
+          <w:p>
+            <w:pPr>
+              <w:spacing w:line="300" w:lineRule="auto"/>
+              <w:ind w:firstLineChars="0" w:firstLine="0"/>
+              <w:jc w:val="center"/>
+            </w:pPr>
             <w:r>
               <w:rPr>
-                <w:rFonts w:eastAsia="黑体"/>
-                <w:b/>
+                <w:rFonts w:hint="eastAsia"/>
               </w:rPr>
-              <w:t>）</w:t>
+              <w:t>图</w:t>
+            </w:r>
+            <w:r>
+              <w:rPr>
+                <w:rFonts w:hint="eastAsia"/>
+              </w:rPr>
+              <w:t>1</w:t>
+            </w:r>
+            <w:r>
+              <w:rPr>
+                <w:rFonts w:hint="eastAsia"/>
+              </w:rPr>
+              <w:t>搭载电磁超声探头的多旋翼无人机</w:t>
             </w:r>
           </w:p>
           <w:p>
@@ -6728,103 +6858,643 @@
               <w:jc w:val="left"/>
             </w:pPr>
             <w:r>
-              <w:t>完成无人机系统平台搭建，集成</w:t>
-            </w:r>
-            <w:r>
-              <w:t>Livox MID-360</w:t>
-            </w:r>
-            <w:r>
-              <w:t>激光雷达、</w:t>
-            </w:r>
-            <w:r>
-              <w:t>Intel RealSense D435</w:t>
-            </w:r>
-            <w:r>
-              <w:t>深度相机与</w:t>
-            </w:r>
-            <w:r>
-              <w:t>PX4</w:t>
-            </w:r>
-            <w:r>
-              <w:t>飞控。通过</w:t>
-            </w:r>
-            <w:r>
-              <w:t>MAVROS</w:t>
-            </w:r>
-            <w:r>
-              <w:t>实现飞控与地面计算机通信，利用</w:t>
-            </w:r>
-            <w:r>
-              <w:t>FAST-LIO 2.0</w:t>
-            </w:r>
-            <w:r>
-              <w:t>（</w:t>
-            </w:r>
-            <w:r>
-              <w:t>IEKF + ikd-Tree</w:t>
-            </w:r>
-            <w:r>
-              <w:t>）提供实时</w:t>
-            </w:r>
-            <w:r>
-              <w:t>6-DOF</w:t>
-            </w:r>
-            <w:r>
-              <w:t>位姿估计。开发</w:t>
-            </w:r>
-            <w:r>
-              <w:t>lidar_to_mavros.py</w:t>
-            </w:r>
-            <w:r>
-              <w:t>桥接节点，将里程计数据转换为</w:t>
-            </w:r>
-            <w:r>
-              <w:t>MAVROS</w:t>
-            </w:r>
-            <w:r>
-              <w:t>视觉位姿反馈。系统已实现遥控下的姿态稳定飞行。</w:t>
-            </w:r>
-          </w:p>
-          <w:p>
-            <w:pPr>
-              <w:spacing w:before="40" w:after="20" w:line="300" w:lineRule="auto"/>
-              <w:ind w:firstLine="422"/>
+              <w:t>在定位与环境感知方面，系统搭载</w:t>
+            </w:r>
+            <w:proofErr w:type="spellStart"/>
+            <w:r>
+              <w:t>Livox</w:t>
+            </w:r>
+            <w:proofErr w:type="spellEnd"/>
+            <w:r>
+              <w:t xml:space="preserve"> MID-360</w:t>
+            </w:r>
+            <w:r>
+              <w:t>激光雷达，结合</w:t>
+            </w:r>
+            <w:r>
+              <w:t>FAST-LIO2</w:t>
+            </w:r>
+            <w:r>
+              <w:t>实现激光雷达与惯性测量数据的紧耦合融合，以约</w:t>
+            </w:r>
+            <w:r>
+              <w:t>50 Hz</w:t>
+            </w:r>
+            <w:r>
+              <w:t>输出无人机六自由度位姿，为弱</w:t>
+            </w:r>
+            <w:r>
+              <w:t>GNSS</w:t>
+            </w:r>
+            <w:r>
+              <w:t>环境下的自主定位与运动状态分析提供支持。同时，采用</w:t>
+            </w:r>
+            <w:r>
+              <w:t>Intel RealSense D435 RGBD</w:t>
+            </w:r>
+            <w:r>
+              <w:t>相机，以约</w:t>
+            </w:r>
+            <w:r>
+              <w:t>30 Hz</w:t>
+            </w:r>
+            <w:r>
+              <w:t>采集对齐的彩色与深度图像，通过深度图感兴趣区域提取六维视觉特征，为目标接近与接触状态判别提供感知信息。</w:t>
+            </w:r>
+          </w:p>
+          <w:p>
+            <w:pPr>
+              <w:spacing w:line="300" w:lineRule="auto"/>
+              <w:ind w:firstLine="420"/>
               <w:jc w:val="left"/>
             </w:pPr>
             <w:r>
+              <w:t>在电磁超声检测方面，系统集成</w:t>
+            </w:r>
+            <w:r>
+              <w:t>KPROPUS AIR</w:t>
+            </w:r>
+            <w:r>
+              <w:t>测厚仪，通过</w:t>
+            </w:r>
+            <w:r>
+              <w:t>USB</w:t>
+            </w:r>
+            <w:r>
+              <w:t>接口与机载计算机通信，并开发</w:t>
+            </w:r>
+            <w:r>
+              <w:t>ROS</w:t>
+            </w:r>
+            <w:r>
+              <w:t>驱动节点，实现超声波形的实时读取与发布，采样率为</w:t>
+            </w:r>
+            <w:r>
+              <w:t>40 MHz</w:t>
+            </w:r>
+            <w:r>
+              <w:t>，波形发布频率约</w:t>
+            </w:r>
+            <w:r>
               <w:rPr>
-                <w:rFonts w:eastAsia="黑体" w:hint="eastAsia"/>
-                <w:b/>
+                <w:rFonts w:hint="eastAsia"/>
               </w:rPr>
-              <w:t>3</w:t>
-            </w:r>
+              <w:t>2</w:t>
+            </w:r>
+            <w:r>
+              <w:t xml:space="preserve"> Hz</w:t>
+            </w:r>
+            <w:r>
+              <w:t>。</w:t>
+            </w:r>
+          </w:p>
+          <w:tbl>
+            <w:tblPr>
+              <w:tblStyle w:val="af2"/>
+              <w:tblW w:w="0" w:type="auto"/>
+              <w:tblLook w:val="04A0" w:firstRow="1" w:lastRow="0" w:firstColumn="1" w:lastColumn="0" w:noHBand="0" w:noVBand="1"/>
+            </w:tblPr>
+            <w:tblGrid>
+              <w:gridCol w:w="4709"/>
+              <w:gridCol w:w="4709"/>
+            </w:tblGrid>
+            <w:tr>
+              <w:tc>
+                <w:tcPr>
+                  <w:tcW w:w="4709" w:type="dxa"/>
+                </w:tcPr>
+                <w:p>
+                  <w:pPr>
+                    <w:spacing w:line="300" w:lineRule="auto"/>
+                    <w:ind w:firstLineChars="0" w:firstLine="0"/>
+                    <w:jc w:val="center"/>
+                    <w:rPr>
+                      <w:rFonts w:hint="eastAsia"/>
+                    </w:rPr>
+                  </w:pPr>
+                  <w:r>
+                    <w:rPr>
+                      <w:noProof/>
+                    </w:rPr>
+                    <w:drawing>
+                      <wp:inline distT="0" distB="0" distL="0" distR="0" wp14:anchorId="20989DAD" wp14:editId="4CFE87D3">
+                        <wp:extent cx="2880000" cy="2107818"/>
+                        <wp:effectExtent l="0" t="0" r="0" b="6985"/>
+                        <wp:docPr id="703301224" name="图片 3"/>
+                        <wp:cNvGraphicFramePr>
+                          <a:graphicFrameLocks xmlns:a="http://schemas.openxmlformats.org/drawingml/2006/main" noChangeAspect="1"/>
+                        </wp:cNvGraphicFramePr>
+                        <a:graphic xmlns:a="http://schemas.openxmlformats.org/drawingml/2006/main">
+                          <a:graphicData uri="http://schemas.openxmlformats.org/drawingml/2006/picture">
+                            <pic:pic xmlns:pic="http://schemas.openxmlformats.org/drawingml/2006/picture">
+                              <pic:nvPicPr>
+                                <pic:cNvPr id="0" name="Picture 5"/>
+                                <pic:cNvPicPr>
+                                  <a:picLocks noChangeAspect="1" noChangeArrowheads="1"/>
+                                </pic:cNvPicPr>
+                              </pic:nvPicPr>
+                              <pic:blipFill>
+                                <a:blip r:embed="rId15" cstate="print">
+                                  <a:extLst>
+                                    <a:ext uri="{28A0092B-C50C-407E-A947-70E740481C1C}">
+                                      <a14:useLocalDpi xmlns:a14="http://schemas.microsoft.com/office/drawing/2010/main" val="0"/>
+                                    </a:ext>
+                                  </a:extLst>
+                                </a:blip>
+                                <a:srcRect/>
+                                <a:stretch>
+                                  <a:fillRect/>
+                                </a:stretch>
+                              </pic:blipFill>
+                              <pic:spPr bwMode="auto">
+                                <a:xfrm>
+                                  <a:off x="0" y="0"/>
+                                  <a:ext cx="2880000" cy="2107818"/>
+                                </a:xfrm>
+                                <a:prstGeom prst="rect">
+                                  <a:avLst/>
+                                </a:prstGeom>
+                                <a:noFill/>
+                                <a:ln>
+                                  <a:noFill/>
+                                </a:ln>
+                              </pic:spPr>
+                            </pic:pic>
+                          </a:graphicData>
+                        </a:graphic>
+                      </wp:inline>
+                    </w:drawing>
+                  </w:r>
+                </w:p>
+                <w:p>
+                  <w:pPr>
+                    <w:spacing w:line="300" w:lineRule="auto"/>
+                    <w:ind w:firstLineChars="0" w:firstLine="0"/>
+                    <w:jc w:val="center"/>
+                    <w:rPr>
+                      <w:rFonts w:hint="eastAsia"/>
+                    </w:rPr>
+                  </w:pPr>
+                  <w:r>
+                    <w:rPr>
+                      <w:rFonts w:hint="eastAsia"/>
+                    </w:rPr>
+                    <w:t>图</w:t>
+                  </w:r>
+                  <w:r>
+                    <w:rPr>
+                      <w:rFonts w:hint="eastAsia"/>
+                    </w:rPr>
+                    <w:t>1</w:t>
+                  </w:r>
+                  <w:r>
+                    <w:rPr>
+                      <w:rFonts w:hint="eastAsia"/>
+                    </w:rPr>
+                    <w:t>接触状态下</w:t>
+                  </w:r>
+                  <w:r>
+                    <w:rPr>
+                      <w:rFonts w:hint="eastAsia"/>
+                    </w:rPr>
+                    <w:t>EMAT</w:t>
+                  </w:r>
+                  <w:r>
+                    <w:rPr>
+                      <w:rFonts w:hint="eastAsia"/>
+                    </w:rPr>
+                    <w:t>回波</w:t>
+                  </w:r>
+                </w:p>
+              </w:tc>
+              <w:tc>
+                <w:tcPr>
+                  <w:tcW w:w="4709" w:type="dxa"/>
+                </w:tcPr>
+                <w:p>
+                  <w:pPr>
+                    <w:spacing w:line="300" w:lineRule="auto"/>
+                    <w:ind w:firstLineChars="0" w:firstLine="0"/>
+                    <w:jc w:val="center"/>
+                    <w:rPr>
+                      <w:rFonts w:hint="eastAsia"/>
+                    </w:rPr>
+                  </w:pPr>
+                  <w:r>
+                    <w:rPr>
+                      <w:rFonts w:hint="eastAsia"/>
+                      <w:noProof/>
+                    </w:rPr>
+                    <w:drawing>
+                      <wp:inline distT="0" distB="0" distL="0" distR="0" wp14:anchorId="39CEC52D" wp14:editId="21802B01">
+                        <wp:extent cx="2880000" cy="2110054"/>
+                        <wp:effectExtent l="0" t="0" r="0" b="5080"/>
+                        <wp:docPr id="1018076170" name="图片 5"/>
+                        <wp:cNvGraphicFramePr>
+                          <a:graphicFrameLocks xmlns:a="http://schemas.openxmlformats.org/drawingml/2006/main" noChangeAspect="1"/>
+                        </wp:cNvGraphicFramePr>
+                        <a:graphic xmlns:a="http://schemas.openxmlformats.org/drawingml/2006/main">
+                          <a:graphicData uri="http://schemas.openxmlformats.org/drawingml/2006/picture">
+                            <pic:pic xmlns:pic="http://schemas.openxmlformats.org/drawingml/2006/picture">
+                              <pic:nvPicPr>
+                                <pic:cNvPr id="1018076170" name="图片 1018076170"/>
+                                <pic:cNvPicPr/>
+                              </pic:nvPicPr>
+                              <pic:blipFill>
+                                <a:blip r:embed="rId16" cstate="print">
+                                  <a:extLst>
+                                    <a:ext uri="{28A0092B-C50C-407E-A947-70E740481C1C}">
+                                      <a14:useLocalDpi xmlns:a14="http://schemas.microsoft.com/office/drawing/2010/main" val="0"/>
+                                    </a:ext>
+                                  </a:extLst>
+                                </a:blip>
+                                <a:stretch>
+                                  <a:fillRect/>
+                                </a:stretch>
+                              </pic:blipFill>
+                              <pic:spPr>
+                                <a:xfrm>
+                                  <a:off x="0" y="0"/>
+                                  <a:ext cx="2880000" cy="2110054"/>
+                                </a:xfrm>
+                                <a:prstGeom prst="rect">
+                                  <a:avLst/>
+                                </a:prstGeom>
+                              </pic:spPr>
+                            </pic:pic>
+                          </a:graphicData>
+                        </a:graphic>
+                      </wp:inline>
+                    </w:drawing>
+                  </w:r>
+                </w:p>
+                <w:p>
+                  <w:pPr>
+                    <w:spacing w:line="300" w:lineRule="auto"/>
+                    <w:ind w:firstLineChars="0" w:firstLine="0"/>
+                    <w:jc w:val="center"/>
+                    <w:rPr>
+                      <w:rFonts w:hint="eastAsia"/>
+                    </w:rPr>
+                  </w:pPr>
+                  <w:r>
+                    <w:rPr>
+                      <w:rFonts w:hint="eastAsia"/>
+                    </w:rPr>
+                    <w:t>图</w:t>
+                  </w:r>
+                  <w:r>
+                    <w:rPr>
+                      <w:rFonts w:hint="eastAsia"/>
+                    </w:rPr>
+                    <w:t>2</w:t>
+                  </w:r>
+                  <w:r>
+                    <w:rPr>
+                      <w:rFonts w:hint="eastAsia"/>
+                    </w:rPr>
+                    <w:t>接触状态下</w:t>
+                  </w:r>
+                  <w:r>
+                    <w:rPr>
+                      <w:rFonts w:hint="eastAsia"/>
+                    </w:rPr>
+                    <w:t>EMAT</w:t>
+                  </w:r>
+                  <w:r>
+                    <w:rPr>
+                      <w:rFonts w:hint="eastAsia"/>
+                    </w:rPr>
+                    <w:t>包络</w:t>
+                  </w:r>
+                </w:p>
+              </w:tc>
+            </w:tr>
+            <w:tr>
+              <w:tc>
+                <w:tcPr>
+                  <w:tcW w:w="4709" w:type="dxa"/>
+                </w:tcPr>
+                <w:p>
+                  <w:pPr>
+                    <w:spacing w:line="300" w:lineRule="auto"/>
+                    <w:ind w:firstLineChars="0" w:firstLine="0"/>
+                    <w:jc w:val="center"/>
+                    <w:rPr>
+                      <w:rFonts w:hint="eastAsia"/>
+                    </w:rPr>
+                  </w:pPr>
+                  <w:r>
+                    <w:rPr>
+                      <w:rFonts w:hint="eastAsia"/>
+                      <w:noProof/>
+                    </w:rPr>
+                    <w:lastRenderedPageBreak/>
+                    <w:drawing>
+                      <wp:inline distT="0" distB="0" distL="0" distR="0" wp14:anchorId="6CCC1865" wp14:editId="1009B51A">
+                        <wp:extent cx="2880000" cy="2107072"/>
+                        <wp:effectExtent l="0" t="0" r="0" b="7620"/>
+                        <wp:docPr id="622760742" name="图片 6"/>
+                        <wp:cNvGraphicFramePr>
+                          <a:graphicFrameLocks xmlns:a="http://schemas.openxmlformats.org/drawingml/2006/main" noChangeAspect="1"/>
+                        </wp:cNvGraphicFramePr>
+                        <a:graphic xmlns:a="http://schemas.openxmlformats.org/drawingml/2006/main">
+                          <a:graphicData uri="http://schemas.openxmlformats.org/drawingml/2006/picture">
+                            <pic:pic xmlns:pic="http://schemas.openxmlformats.org/drawingml/2006/picture">
+                              <pic:nvPicPr>
+                                <pic:cNvPr id="622760742" name="图片 622760742"/>
+                                <pic:cNvPicPr/>
+                              </pic:nvPicPr>
+                              <pic:blipFill>
+                                <a:blip r:embed="rId17" cstate="print">
+                                  <a:extLst>
+                                    <a:ext uri="{28A0092B-C50C-407E-A947-70E740481C1C}">
+                                      <a14:useLocalDpi xmlns:a14="http://schemas.microsoft.com/office/drawing/2010/main" val="0"/>
+                                    </a:ext>
+                                  </a:extLst>
+                                </a:blip>
+                                <a:stretch>
+                                  <a:fillRect/>
+                                </a:stretch>
+                              </pic:blipFill>
+                              <pic:spPr>
+                                <a:xfrm>
+                                  <a:off x="0" y="0"/>
+                                  <a:ext cx="2880000" cy="2107072"/>
+                                </a:xfrm>
+                                <a:prstGeom prst="rect">
+                                  <a:avLst/>
+                                </a:prstGeom>
+                              </pic:spPr>
+                            </pic:pic>
+                          </a:graphicData>
+                        </a:graphic>
+                      </wp:inline>
+                    </w:drawing>
+                  </w:r>
+                </w:p>
+                <w:p>
+                  <w:pPr>
+                    <w:spacing w:line="300" w:lineRule="auto"/>
+                    <w:ind w:firstLineChars="0" w:firstLine="0"/>
+                    <w:jc w:val="center"/>
+                    <w:rPr>
+                      <w:rFonts w:hint="eastAsia"/>
+                    </w:rPr>
+                  </w:pPr>
+                  <w:r>
+                    <w:rPr>
+                      <w:rFonts w:hint="eastAsia"/>
+                    </w:rPr>
+                    <w:t>图</w:t>
+                  </w:r>
+                  <w:r>
+                    <w:rPr>
+                      <w:rFonts w:hint="eastAsia"/>
+                    </w:rPr>
+                    <w:t>3</w:t>
+                  </w:r>
+                  <w:r>
+                    <w:rPr>
+                      <w:rFonts w:hint="eastAsia"/>
+                    </w:rPr>
+                    <w:t>非接触状态下</w:t>
+                  </w:r>
+                  <w:r>
+                    <w:rPr>
+                      <w:rFonts w:hint="eastAsia"/>
+                    </w:rPr>
+                    <w:t>EMAT</w:t>
+                  </w:r>
+                  <w:r>
+                    <w:rPr>
+                      <w:rFonts w:hint="eastAsia"/>
+                    </w:rPr>
+                    <w:t>回波</w:t>
+                  </w:r>
+                </w:p>
+              </w:tc>
+              <w:tc>
+                <w:tcPr>
+                  <w:tcW w:w="4709" w:type="dxa"/>
+                </w:tcPr>
+                <w:p>
+                  <w:pPr>
+                    <w:spacing w:line="300" w:lineRule="auto"/>
+                    <w:ind w:firstLineChars="0" w:firstLine="0"/>
+                    <w:jc w:val="center"/>
+                    <w:rPr>
+                      <w:rFonts w:hint="eastAsia"/>
+                    </w:rPr>
+                  </w:pPr>
+                  <w:r>
+                    <w:rPr>
+                      <w:rFonts w:hint="eastAsia"/>
+                      <w:noProof/>
+                    </w:rPr>
+                    <w:drawing>
+                      <wp:inline distT="0" distB="0" distL="0" distR="0" wp14:anchorId="6C60697A" wp14:editId="625272C4">
+                        <wp:extent cx="2880000" cy="2110054"/>
+                        <wp:effectExtent l="0" t="0" r="0" b="5080"/>
+                        <wp:docPr id="338685148" name="图片 7"/>
+                        <wp:cNvGraphicFramePr>
+                          <a:graphicFrameLocks xmlns:a="http://schemas.openxmlformats.org/drawingml/2006/main" noChangeAspect="1"/>
+                        </wp:cNvGraphicFramePr>
+                        <a:graphic xmlns:a="http://schemas.openxmlformats.org/drawingml/2006/main">
+                          <a:graphicData uri="http://schemas.openxmlformats.org/drawingml/2006/picture">
+                            <pic:pic xmlns:pic="http://schemas.openxmlformats.org/drawingml/2006/picture">
+                              <pic:nvPicPr>
+                                <pic:cNvPr id="338685148" name="图片 338685148"/>
+                                <pic:cNvPicPr/>
+                              </pic:nvPicPr>
+                              <pic:blipFill>
+                                <a:blip r:embed="rId18" cstate="print">
+                                  <a:extLst>
+                                    <a:ext uri="{28A0092B-C50C-407E-A947-70E740481C1C}">
+                                      <a14:useLocalDpi xmlns:a14="http://schemas.microsoft.com/office/drawing/2010/main" val="0"/>
+                                    </a:ext>
+                                  </a:extLst>
+                                </a:blip>
+                                <a:stretch>
+                                  <a:fillRect/>
+                                </a:stretch>
+                              </pic:blipFill>
+                              <pic:spPr>
+                                <a:xfrm>
+                                  <a:off x="0" y="0"/>
+                                  <a:ext cx="2880000" cy="2110054"/>
+                                </a:xfrm>
+                                <a:prstGeom prst="rect">
+                                  <a:avLst/>
+                                </a:prstGeom>
+                              </pic:spPr>
+                            </pic:pic>
+                          </a:graphicData>
+                        </a:graphic>
+                      </wp:inline>
+                    </w:drawing>
+                  </w:r>
+                </w:p>
+                <w:p>
+                  <w:pPr>
+                    <w:spacing w:line="300" w:lineRule="auto"/>
+                    <w:ind w:firstLineChars="0" w:firstLine="0"/>
+                    <w:jc w:val="center"/>
+                    <w:rPr>
+                      <w:rFonts w:hint="eastAsia"/>
+                    </w:rPr>
+                  </w:pPr>
+                  <w:r>
+                    <w:rPr>
+                      <w:rFonts w:hint="eastAsia"/>
+                    </w:rPr>
+                    <w:t>图</w:t>
+                  </w:r>
+                  <w:r>
+                    <w:rPr>
+                      <w:rFonts w:hint="eastAsia"/>
+                    </w:rPr>
+                    <w:t>4</w:t>
+                  </w:r>
+                  <w:r>
+                    <w:rPr>
+                      <w:rFonts w:hint="eastAsia"/>
+                    </w:rPr>
+                    <w:t>非接触状态下</w:t>
+                  </w:r>
+                  <w:r>
+                    <w:rPr>
+                      <w:rFonts w:hint="eastAsia"/>
+                    </w:rPr>
+                    <w:t>EMAT</w:t>
+                  </w:r>
+                  <w:r>
+                    <w:rPr>
+                      <w:rFonts w:hint="eastAsia"/>
+                    </w:rPr>
+                    <w:t>包络</w:t>
+                  </w:r>
+                </w:p>
+              </w:tc>
+            </w:tr>
+          </w:tbl>
+          <w:p>
+            <w:pPr>
+              <w:spacing w:line="300" w:lineRule="auto"/>
+              <w:ind w:firstLine="420"/>
+              <w:jc w:val="left"/>
+            </w:pPr>
+            <w:r>
+              <w:t>基于上述硬件与软件架构，平台初步具备激光雷达惯性定位、深度视觉感知、电磁超声信号采集和物理约束</w:t>
+            </w:r>
+            <w:r>
+              <w:t>Transformer</w:t>
+            </w:r>
+            <w:r>
+              <w:t>在线推理能力，为后续开展多模态特征融合、接触状态识别及无人机自主接触检测闭环控制实验奠定了基础。</w:t>
+            </w:r>
+          </w:p>
+          <w:p>
+            <w:pPr>
+              <w:spacing w:line="300" w:lineRule="auto"/>
+              <w:ind w:firstLineChars="0" w:firstLine="0"/>
+              <w:jc w:val="left"/>
+            </w:pPr>
             <w:r>
               <w:rPr>
-                <w:rFonts w:eastAsia="黑体"/>
-                <w:b/>
+                <w:noProof/>
               </w:rPr>
-              <w:t xml:space="preserve">.3 </w:t>
-            </w:r>
+              <w:drawing>
+                <wp:inline distT="0" distB="0" distL="0" distR="0" wp14:anchorId="52BD7563" wp14:editId="424F5ACF">
+                  <wp:extent cx="5986780" cy="3742055"/>
+                  <wp:effectExtent l="0" t="0" r="0" b="0"/>
+                  <wp:docPr id="1313618223" name="图片 2"/>
+                  <wp:cNvGraphicFramePr>
+                    <a:graphicFrameLocks xmlns:a="http://schemas.openxmlformats.org/drawingml/2006/main" noChangeAspect="1"/>
+                  </wp:cNvGraphicFramePr>
+                  <a:graphic xmlns:a="http://schemas.openxmlformats.org/drawingml/2006/main">
+                    <a:graphicData uri="http://schemas.openxmlformats.org/drawingml/2006/picture">
+                      <pic:pic xmlns:pic="http://schemas.openxmlformats.org/drawingml/2006/picture">
+                        <pic:nvPicPr>
+                          <pic:cNvPr id="0" name="Picture 3"/>
+                          <pic:cNvPicPr>
+                            <a:picLocks noChangeAspect="1" noChangeArrowheads="1"/>
+                          </pic:cNvPicPr>
+                        </pic:nvPicPr>
+                        <pic:blipFill>
+                          <a:blip r:embed="rId19" cstate="print">
+                            <a:extLst>
+                              <a:ext uri="{28A0092B-C50C-407E-A947-70E740481C1C}">
+                                <a14:useLocalDpi xmlns:a14="http://schemas.microsoft.com/office/drawing/2010/main" val="0"/>
+                              </a:ext>
+                            </a:extLst>
+                          </a:blip>
+                          <a:srcRect/>
+                          <a:stretch>
+                            <a:fillRect/>
+                          </a:stretch>
+                        </pic:blipFill>
+                        <pic:spPr bwMode="auto">
+                          <a:xfrm>
+                            <a:off x="0" y="0"/>
+                            <a:ext cx="5986780" cy="3742055"/>
+                          </a:xfrm>
+                          <a:prstGeom prst="rect">
+                            <a:avLst/>
+                          </a:prstGeom>
+                          <a:noFill/>
+                          <a:ln>
+                            <a:noFill/>
+                          </a:ln>
+                        </pic:spPr>
+                      </pic:pic>
+                    </a:graphicData>
+                  </a:graphic>
+                </wp:inline>
+              </w:drawing>
+            </w:r>
+          </w:p>
+          <w:p>
+            <w:pPr>
+              <w:spacing w:line="300" w:lineRule="auto"/>
+              <w:ind w:firstLineChars="0" w:firstLine="0"/>
+              <w:jc w:val="left"/>
+            </w:pPr>
             <w:r>
               <w:rPr>
-                <w:rFonts w:eastAsia="黑体"/>
-                <w:b/>
+                <w:rFonts w:hint="eastAsia"/>
               </w:rPr>
-              <w:t>电磁超声探头硬件开发与调试（</w:t>
+              <w:t>图</w:t>
             </w:r>
             <w:r>
               <w:rPr>
-                <w:rFonts w:eastAsia="黑体"/>
-                <w:b/>
+                <w:rFonts w:hint="eastAsia"/>
               </w:rPr>
-              <w:t>2026.02—2026.04</w:t>
+              <w:t>5</w:t>
             </w:r>
             <w:r>
               <w:rPr>
-                <w:rFonts w:eastAsia="黑体"/>
-                <w:b/>
+                <w:rFonts w:hint="eastAsia"/>
               </w:rPr>
-              <w:t>）</w:t>
+              <w:t>无人机</w:t>
+            </w:r>
+            <w:r>
+              <w:rPr>
+                <w:rFonts w:hint="eastAsia"/>
+              </w:rPr>
+              <w:t>多模态感控</w:t>
+            </w:r>
+            <w:r>
+              <w:rPr>
+                <w:rFonts w:hint="eastAsia"/>
+              </w:rPr>
+              <w:t>接触</w:t>
+            </w:r>
+            <w:r>
+              <w:rPr>
+                <w:rFonts w:hint="eastAsia"/>
+              </w:rPr>
+              <w:t>实验打标</w:t>
             </w:r>
           </w:p>
           <w:p>
@@ -6834,160 +7504,48 @@
               <w:jc w:val="left"/>
             </w:pPr>
             <w:r>
-              <w:t>完成</w:t>
-            </w:r>
-            <w:r>
-              <w:t>EMAT</w:t>
-            </w:r>
-            <w:r>
-              <w:t>探头制作与调试。开发</w:t>
-            </w:r>
-            <w:r>
-              <w:t>ROS</w:t>
-            </w:r>
-            <w:r>
-              <w:t>驱动节点，通过</w:t>
-            </w:r>
-            <w:r>
-              <w:t>USB</w:t>
-            </w:r>
-            <w:r>
-              <w:t>直连</w:t>
-            </w:r>
-            <w:r>
-              <w:t>CH346C</w:t>
-            </w:r>
-            <w:r>
-              <w:t>芯片，以二进制协议（</w:t>
-            </w:r>
-            <w:r>
-              <w:t>0xAB</w:t>
-            </w:r>
-            <w:r>
-              <w:t>头，</w:t>
-            </w:r>
-            <w:r>
-              <w:t>CRC-8</w:t>
-            </w:r>
-            <w:r>
-              <w:t>校验）实现通信。支持厚度读取、波形采集（</w:t>
-            </w:r>
-            <w:r>
-              <w:t>4</w:t>
-            </w:r>
-            <w:r>
-              <w:t>块</w:t>
-            </w:r>
-            <w:r>
-              <w:t>×8185</w:t>
-            </w:r>
-            <w:r>
-              <w:t>采样点，</w:t>
-            </w:r>
-            <w:r>
-              <w:t>8-bit ADC</w:t>
-            </w:r>
-            <w:r>
-              <w:t>）、参数配置等命令。波形采集频率约</w:t>
-            </w:r>
-            <w:r>
-              <w:t>40 Hz</w:t>
-            </w:r>
-            <w:r>
-              <w:t>。开发</w:t>
-            </w:r>
-            <w:r>
-              <w:t>Qt5 C++</w:t>
-            </w:r>
-            <w:r>
-              <w:t>可视化工具，采用</w:t>
-            </w:r>
-            <w:r>
-              <w:t>ring buffer + QTimer</w:t>
-            </w:r>
-            <w:r>
-              <w:t>架构（</w:t>
-            </w:r>
-            <w:r>
-              <w:t>25 ms</w:t>
-            </w:r>
-            <w:r>
-              <w:t>刷新），支持</w:t>
-            </w:r>
-            <w:r>
-              <w:t>DC</w:t>
-            </w:r>
-            <w:r>
-              <w:t>去除与</w:t>
-            </w:r>
-            <w:r>
-              <w:t>RMS</w:t>
-            </w:r>
-            <w:r>
-              <w:t>显示。</w:t>
-            </w:r>
-          </w:p>
-          <w:p>
-            <w:pPr>
-              <w:spacing w:before="40" w:after="20" w:line="300" w:lineRule="auto"/>
-              <w:ind w:firstLine="422"/>
+              <w:rPr>
+                <w:rFonts w:hint="eastAsia"/>
+              </w:rPr>
+              <w:t xml:space="preserve">5.2 </w:t>
+            </w:r>
+            <w:r>
+              <w:rPr>
+                <w:rFonts w:hint="eastAsia"/>
+              </w:rPr>
+              <w:t>可视化结果</w:t>
+            </w:r>
+          </w:p>
+          <w:p>
+            <w:pPr>
+              <w:spacing w:line="300" w:lineRule="auto"/>
+              <w:ind w:firstLine="420"/>
               <w:jc w:val="left"/>
             </w:pPr>
+          </w:p>
+          <w:p>
+            <w:pPr>
+              <w:spacing w:line="300" w:lineRule="auto"/>
+              <w:ind w:firstLine="420"/>
+              <w:jc w:val="left"/>
+            </w:pPr>
             <w:r>
               <w:rPr>
-                <w:rFonts w:eastAsia="黑体" w:hint="eastAsia"/>
-                <w:b/>
+                <w:rFonts w:hint="eastAsia"/>
               </w:rPr>
-              <w:t>3</w:t>
+              <w:t xml:space="preserve">5.3 </w:t>
             </w:r>
             <w:r>
               <w:rPr>
-                <w:rFonts w:eastAsia="黑体"/>
-                <w:b/>
+                <w:rFonts w:hint="eastAsia"/>
               </w:rPr>
-              <w:t xml:space="preserve">.4 </w:t>
+              <w:t>对比</w:t>
             </w:r>
             <w:r>
               <w:rPr>
-                <w:rFonts w:eastAsia="黑体"/>
-                <w:b/>
+                <w:rFonts w:hint="eastAsia"/>
               </w:rPr>
-              <w:t>多模态数据采集系统构建</w:t>
-            </w:r>
-            <w:r>
-              <w:rPr>
-                <w:rFonts w:eastAsia="黑体" w:hint="eastAsia"/>
-                <w:b/>
-              </w:rPr>
-              <w:t>（</w:t>
-            </w:r>
-            <w:r>
-              <w:rPr>
-                <w:rFonts w:eastAsia="黑体" w:hint="eastAsia"/>
-                <w:b/>
-              </w:rPr>
-              <w:t xml:space="preserve">2026.05 </w:t>
-            </w:r>
-            <w:r>
-              <w:rPr>
-                <w:rFonts w:eastAsia="黑体"/>
-                <w:b/>
-              </w:rPr>
-              <w:t>–</w:t>
-            </w:r>
-            <w:r>
-              <w:rPr>
-                <w:rFonts w:eastAsia="黑体" w:hint="eastAsia"/>
-                <w:b/>
-              </w:rPr>
-              <w:t xml:space="preserve"> 2026.06</w:t>
-            </w:r>
-            <w:r>
-              <w:rPr>
-                <w:rFonts w:eastAsia="黑体" w:hint="eastAsia"/>
-                <w:b/>
-              </w:rPr>
-              <w:t>）</w:t>
+              <w:t>实验</w:t>
             </w:r>
           </w:p>
           <w:p>
@@ -6996,71 +7554,6 @@
               <w:ind w:firstLine="420"/>
               <w:jc w:val="left"/>
             </w:pPr>
-            <w:r>
-              <w:t>开发基于视觉</w:t>
-            </w:r>
-            <w:r>
-              <w:t>ROI</w:t>
-            </w:r>
-            <w:r>
-              <w:t>的自主规划程序：用户在</w:t>
-            </w:r>
-            <w:r>
-              <w:t>RGB</w:t>
-            </w:r>
-            <w:r>
-              <w:t>图像中选取目标区域后，系统完成路径规划与末端精确接近。飞行过程中同步采集位姿、</w:t>
-            </w:r>
-            <w:r>
-              <w:t>RGBD</w:t>
-            </w:r>
-            <w:r>
-              <w:t>视频流与</w:t>
-            </w:r>
-            <w:r>
-              <w:t>EMAT</w:t>
-            </w:r>
-            <w:r>
-              <w:t>回波信号，构建结构化多模态数据集，为后续模型训练提供数据支撑。</w:t>
-            </w:r>
-          </w:p>
-          <w:p>
-            <w:pPr>
-              <w:spacing w:before="40" w:after="20" w:line="300" w:lineRule="auto"/>
-              <w:ind w:firstLine="422"/>
-              <w:jc w:val="left"/>
-            </w:pPr>
-            <w:r>
-              <w:rPr>
-                <w:rFonts w:eastAsia="黑体" w:hint="eastAsia"/>
-                <w:b/>
-              </w:rPr>
-              <w:t>3</w:t>
-            </w:r>
-            <w:r>
-              <w:rPr>
-                <w:rFonts w:eastAsia="黑体"/>
-                <w:b/>
-              </w:rPr>
-              <w:t xml:space="preserve">.5 </w:t>
-            </w:r>
-            <w:r>
-              <w:rPr>
-                <w:rFonts w:eastAsia="黑体"/>
-                <w:b/>
-              </w:rPr>
-              <w:t>视觉引导与接触控制验证</w:t>
-            </w:r>
-          </w:p>
-          <w:p>
-            <w:pPr>
-              <w:spacing w:line="300" w:lineRule="auto"/>
-              <w:ind w:firstLine="420"/>
-              <w:jc w:val="left"/>
-            </w:pPr>
-            <w:r>
-              <w:t>实现无人机完全自动驾驶下的任意曲面稳定接触，验证了从视觉引导到接触建立再到稳定扫查的完整流程。</w:t>
-            </w:r>
           </w:p>
         </w:tc>
       </w:tr>
@@ -7115,272 +7608,127 @@
           </w:tcPr>
           <w:p>
             <w:pPr>
+              <w:spacing w:afterLines="50" w:after="120"/>
+              <w:ind w:firstLine="480"/>
+              <w:jc w:val="left"/>
+              <w:rPr>
+                <w:rFonts w:eastAsia="楷体"/>
+                <w:sz w:val="24"/>
+              </w:rPr>
+            </w:pPr>
+            <w:r>
+              <w:rPr>
+                <w:rFonts w:eastAsia="楷体"/>
+                <w:sz w:val="24"/>
+              </w:rPr>
+              <w:lastRenderedPageBreak/>
+              <w:t>按《研究生学位论文撰写格式规范》的格式要求分类填写与学位论文相关的阶段性研究成果，例如期刊论文、会议论文、专利、科研获奖等，限填第一作者或导师为第一作者时的第二作者成果，其中已录用、已投稿或拟投稿的在括号内注明（可续页）</w:t>
+            </w:r>
+          </w:p>
+          <w:tbl>
+            <w:tblPr>
+              <w:tblStyle w:val="af2"/>
+              <w:tblW w:w="0" w:type="auto"/>
+              <w:tblLook w:val="04A0" w:firstRow="1" w:lastRow="0" w:firstColumn="1" w:lastColumn="0" w:noHBand="0" w:noVBand="1"/>
+            </w:tblPr>
+            <w:tblGrid>
+              <w:gridCol w:w="9418"/>
+            </w:tblGrid>
+            <w:tr>
+              <w:tc>
+                <w:tcPr>
+                  <w:tcW w:w="9418" w:type="dxa"/>
+                </w:tcPr>
+                <w:p>
+                  <w:pPr>
+                    <w:spacing w:afterLines="50" w:after="120"/>
+                    <w:ind w:firstLine="420"/>
+                    <w:rPr>
+                      <w:rFonts w:ascii="楷体" w:eastAsia="楷体" w:hAnsi="楷体" w:hint="eastAsia"/>
+                    </w:rPr>
+                  </w:pPr>
+                  <w:r>
+                    <w:rPr>
+                      <w:rFonts w:ascii="楷体" w:eastAsia="楷体" w:hAnsi="楷体" w:hint="eastAsia"/>
+                    </w:rPr>
+                    <w:t>1.未按</w:t>
+                  </w:r>
+                  <w:r>
+                    <w:rPr>
+                      <w:rFonts w:ascii="楷体" w:eastAsia="楷体" w:hAnsi="楷体" w:hint="eastAsia"/>
+                    </w:rPr>
+                    <w:t>开题计划完成的</w:t>
+                  </w:r>
+                  <w:r>
+                    <w:rPr>
+                      <w:rFonts w:ascii="楷体" w:eastAsia="楷体" w:hAnsi="楷体" w:hint="eastAsia"/>
+                    </w:rPr>
+                    <w:t>研究</w:t>
+                  </w:r>
+                  <w:r>
+                    <w:rPr>
+                      <w:rFonts w:ascii="楷体" w:eastAsia="楷体" w:hAnsi="楷体" w:hint="eastAsia"/>
+                    </w:rPr>
+                    <w:t>工作</w:t>
+                  </w:r>
+                  <w:r>
+                    <w:rPr>
+                      <w:rFonts w:ascii="楷体" w:eastAsia="楷体" w:hAnsi="楷体" w:hint="eastAsia"/>
+                    </w:rPr>
+                    <w:t>，研究工作存在的原理性、技术性难题以及在实验条件等方面的限制（可续页）</w:t>
+                  </w:r>
+                </w:p>
+                <w:p>
+                  <w:pPr>
+                    <w:spacing w:line="300" w:lineRule="auto"/>
+                    <w:ind w:firstLineChars="0" w:firstLine="0"/>
+                    <w:jc w:val="left"/>
+                    <w:rPr>
+                      <w:rFonts w:hint="eastAsia"/>
+                    </w:rPr>
+                  </w:pPr>
+                </w:p>
+              </w:tc>
+            </w:tr>
+            <w:tr>
+              <w:tc>
+                <w:tcPr>
+                  <w:tcW w:w="9418" w:type="dxa"/>
+                </w:tcPr>
+                <w:p>
+                  <w:pPr>
+                    <w:spacing w:afterLines="50" w:after="120"/>
+                    <w:ind w:firstLine="420"/>
+                    <w:rPr>
+                      <w:rFonts w:ascii="楷体" w:eastAsia="楷体" w:hAnsi="楷体" w:hint="eastAsia"/>
+                    </w:rPr>
+                  </w:pPr>
+                  <w:r>
+                    <w:rPr>
+                      <w:rFonts w:ascii="楷体" w:eastAsia="楷体" w:hAnsi="楷体" w:hint="eastAsia"/>
+                    </w:rPr>
+                    <w:t>2.针对上述问题采取何种解决办法，对学位论文的研究内容及所采取的理论方法、技术路线和实施方案的进一步调整，以及下一步的研究研究计划（可续页）</w:t>
+                  </w:r>
+                </w:p>
+                <w:p>
+                  <w:pPr>
+                    <w:spacing w:line="300" w:lineRule="auto"/>
+                    <w:ind w:firstLineChars="0" w:firstLine="0"/>
+                    <w:jc w:val="left"/>
+                    <w:rPr>
+                      <w:rFonts w:hint="eastAsia"/>
+                    </w:rPr>
+                  </w:pPr>
+                </w:p>
+              </w:tc>
+            </w:tr>
+          </w:tbl>
+          <w:p>
+            <w:pPr>
               <w:spacing w:line="300" w:lineRule="auto"/>
               <w:ind w:firstLine="420"/>
               <w:jc w:val="left"/>
             </w:pPr>
-            <w:r>
-              <w:t>按《研究生学位论文撰写格式规范》的格式要求分类填写与学位论文相关的阶段性研究成果</w:t>
-            </w:r>
-          </w:p>
-          <w:p>
-            <w:pPr>
-              <w:spacing w:before="40" w:after="20" w:line="300" w:lineRule="auto"/>
-              <w:ind w:firstLine="422"/>
-              <w:jc w:val="left"/>
-            </w:pPr>
-            <w:r>
-              <w:rPr>
-                <w:rFonts w:eastAsia="黑体"/>
-                <w:b/>
-              </w:rPr>
-              <w:t xml:space="preserve">1. </w:t>
-            </w:r>
-            <w:r>
-              <w:rPr>
-                <w:rFonts w:eastAsia="黑体"/>
-                <w:b/>
-              </w:rPr>
-              <w:t>硬件系统</w:t>
-            </w:r>
-          </w:p>
-          <w:p>
-            <w:pPr>
-              <w:spacing w:line="300" w:lineRule="auto"/>
-              <w:ind w:firstLine="420"/>
-              <w:jc w:val="left"/>
-            </w:pPr>
-            <w:r>
-              <w:t>（</w:t>
-            </w:r>
-            <w:r>
-              <w:t>1</w:t>
-            </w:r>
-            <w:r>
-              <w:t>）完成</w:t>
-            </w:r>
-            <w:r>
-              <w:t>EMAT</w:t>
-            </w:r>
-            <w:r>
-              <w:t>探头制作、调试与</w:t>
-            </w:r>
-            <w:r>
-              <w:t>ROS</w:t>
-            </w:r>
-            <w:r>
-              <w:t>驱动开发，实现</w:t>
-            </w:r>
-            <w:r>
-              <w:t>40 Hz</w:t>
-            </w:r>
-            <w:r>
-              <w:t>稳定波形采集；</w:t>
-            </w:r>
-          </w:p>
-          <w:p>
-            <w:pPr>
-              <w:spacing w:line="300" w:lineRule="auto"/>
-              <w:ind w:firstLine="420"/>
-              <w:jc w:val="left"/>
-            </w:pPr>
-            <w:r>
-              <w:t>（</w:t>
-            </w:r>
-            <w:r>
-              <w:t>2</w:t>
-            </w:r>
-            <w:r>
-              <w:t>）完成无人机实验平台搭建，集成</w:t>
-            </w:r>
-            <w:r>
-              <w:t>LiDAR</w:t>
-            </w:r>
-            <w:r>
-              <w:t>、</w:t>
-            </w:r>
-            <w:r>
-              <w:t>RGBD</w:t>
-            </w:r>
-            <w:r>
-              <w:t>相机与</w:t>
-            </w:r>
-            <w:r>
-              <w:t>PX4</w:t>
-            </w:r>
-            <w:r>
-              <w:rPr>
-                <w:rFonts w:hint="eastAsia"/>
-              </w:rPr>
-              <w:t>-Autopilot</w:t>
-            </w:r>
-            <w:r>
-              <w:t>飞控，实现自主飞行与多模态数据同步采集。</w:t>
-            </w:r>
-          </w:p>
-          <w:p>
-            <w:pPr>
-              <w:spacing w:before="40" w:after="20" w:line="300" w:lineRule="auto"/>
-              <w:ind w:firstLine="422"/>
-              <w:jc w:val="left"/>
-            </w:pPr>
-            <w:r>
-              <w:rPr>
-                <w:rFonts w:eastAsia="黑体"/>
-                <w:b/>
-              </w:rPr>
-              <w:t xml:space="preserve">2. </w:t>
-            </w:r>
-            <w:r>
-              <w:rPr>
-                <w:rFonts w:eastAsia="黑体"/>
-                <w:b/>
-              </w:rPr>
-              <w:t>软件系统</w:t>
-            </w:r>
-          </w:p>
-          <w:p>
-            <w:pPr>
-              <w:spacing w:line="300" w:lineRule="auto"/>
-              <w:ind w:firstLine="420"/>
-              <w:jc w:val="left"/>
-            </w:pPr>
-            <w:r>
-              <w:t>（</w:t>
-            </w:r>
-            <w:r>
-              <w:t>1</w:t>
-            </w:r>
-            <w:r>
-              <w:t>）开发</w:t>
-            </w:r>
-            <w:r>
-              <w:t>EMAT ROS</w:t>
-            </w:r>
-            <w:r>
-              <w:t>驱动节点，支持二进制协议通信、自动重连与</w:t>
-            </w:r>
-            <w:r>
-              <w:t>Qt5</w:t>
-            </w:r>
-            <w:r>
-              <w:t>波形可视化；</w:t>
-            </w:r>
-          </w:p>
-          <w:p>
-            <w:pPr>
-              <w:spacing w:line="300" w:lineRule="auto"/>
-              <w:ind w:firstLine="420"/>
-              <w:jc w:val="left"/>
-            </w:pPr>
-            <w:r>
-              <w:t>（</w:t>
-            </w:r>
-            <w:r>
-              <w:t>2</w:t>
-            </w:r>
-            <w:r>
-              <w:t>）开发视觉引导自主规划程序，实现目标选取、路径规划与精确接近的完整流程；</w:t>
-            </w:r>
-          </w:p>
-          <w:p>
-            <w:pPr>
-              <w:spacing w:line="300" w:lineRule="auto"/>
-              <w:ind w:firstLine="420"/>
-              <w:jc w:val="left"/>
-            </w:pPr>
-            <w:r>
-              <w:t>（</w:t>
-            </w:r>
-            <w:r>
-              <w:t>3</w:t>
-            </w:r>
-            <w:r>
-              <w:t>）开发</w:t>
-            </w:r>
-            <w:r>
-              <w:t>record</w:t>
-            </w:r>
-            <w:r>
-              <w:t>数据记录节点，同步记录位姿、</w:t>
-            </w:r>
-            <w:r>
-              <w:t>RGBD</w:t>
-            </w:r>
-            <w:r>
-              <w:t>视频与</w:t>
-            </w:r>
-            <w:r>
-              <w:t>EMAT</w:t>
-            </w:r>
-            <w:r>
-              <w:t>波形数据。</w:t>
-            </w:r>
-          </w:p>
-          <w:p>
-            <w:pPr>
-              <w:spacing w:before="40" w:after="20" w:line="300" w:lineRule="auto"/>
-              <w:ind w:firstLine="422"/>
-              <w:jc w:val="left"/>
-            </w:pPr>
-            <w:r>
-              <w:rPr>
-                <w:rFonts w:eastAsia="黑体"/>
-                <w:b/>
-              </w:rPr>
-              <w:t xml:space="preserve">3. </w:t>
-            </w:r>
-            <w:r>
-              <w:rPr>
-                <w:rFonts w:eastAsia="黑体"/>
-                <w:b/>
-              </w:rPr>
-              <w:t>实验验证</w:t>
-            </w:r>
-          </w:p>
-          <w:p>
-            <w:pPr>
-              <w:spacing w:line="300" w:lineRule="auto"/>
-              <w:ind w:firstLine="420"/>
-              <w:jc w:val="left"/>
-            </w:pPr>
-            <w:r>
-              <w:t>（</w:t>
-            </w:r>
-            <w:r>
-              <w:t>1</w:t>
-            </w:r>
-            <w:r>
-              <w:t>）实现无人机完全自动驾驶下的任意曲面稳定接触；</w:t>
-            </w:r>
-          </w:p>
-          <w:p>
-            <w:pPr>
-              <w:spacing w:line="300" w:lineRule="auto"/>
-              <w:ind w:firstLine="420"/>
-              <w:jc w:val="left"/>
-            </w:pPr>
-            <w:r>
-              <w:t>（</w:t>
-            </w:r>
-            <w:r>
-              <w:t>2</w:t>
-            </w:r>
-            <w:r>
-              <w:t>）验证位置</w:t>
-            </w:r>
-            <w:r>
-              <w:t>-</w:t>
-            </w:r>
-            <w:r>
-              <w:t>速度串级</w:t>
-            </w:r>
-            <w:r>
-              <w:t>PID</w:t>
-            </w:r>
-            <w:r>
-              <w:t>接触控制闭环的有效性。</w:t>
-            </w:r>
           </w:p>
         </w:tc>
       </w:tr>
@@ -7408,7 +7756,6 @@
               <w:jc w:val="left"/>
             </w:pPr>
             <w:r>
-              <w:lastRenderedPageBreak/>
               <w:t>导师对工作进展及研究计划的意见：</w:t>
             </w:r>
           </w:p>
@@ -7953,6 +8300,7 @@
               <w:jc w:val="right"/>
             </w:pPr>
             <w:r>
+              <w:lastRenderedPageBreak/>
               <w:t>负责人签名：</w:t>
             </w:r>
             <w:r>
@@ -8299,7 +8647,6 @@
               </w:rPr>
             </w:pPr>
             <w:r>
-              <w:lastRenderedPageBreak/>
               <w:t>2026.05-2026.11</w:t>
             </w:r>
           </w:p>
@@ -8417,11 +8764,11 @@
       </w:r>
     </w:p>
     <w:sectPr>
-      <w:headerReference w:type="default" r:id="rId14"/>
-      <w:footerReference w:type="even" r:id="rId15"/>
-      <w:footerReference w:type="default" r:id="rId16"/>
-      <w:headerReference w:type="first" r:id="rId17"/>
-      <w:footerReference w:type="first" r:id="rId18"/>
+      <w:headerReference w:type="default" r:id="rId20"/>
+      <w:footerReference w:type="even" r:id="rId21"/>
+      <w:footerReference w:type="default" r:id="rId22"/>
+      <w:headerReference w:type="first" r:id="rId23"/>
+      <w:footerReference w:type="first" r:id="rId24"/>
       <w:pgSz w:w="11906" w:h="16838"/>
       <w:pgMar w:top="1134" w:right="1134" w:bottom="1134" w:left="1134" w:header="851" w:footer="992" w:gutter="0"/>
       <w:cols w:space="720"/>

</xml_diff>